<commit_message>
fix: auditoria de consistência — atualiza todos os valores numéricos
Valores corrigidos em todos os documentos (Word, PPT, guia, LaTeX):

HLM M4 gap residual: 5,4% → 6,2% (exp(-0.0644)-1 = -6.24%)
HLM M1 gap bruto: 19,5% → 19,3% (exp(-0.2148)-1 = -19.33%)
HLM M3 gap líquido: 9,5% → 9,7%
Mediação UPA: 10,5pp/54% → 9,6pp/52%
Mediação ocupacional: 4,1pp → 3,5pp
Mediação total: 74,5% → 70,0%
OR GLMM M1: 0,705 → 0,704

Konfound — população completa (N=7.689.426):
  pkonfound HLM: 98,8%(M1)/97,5%(M2M3)/96,3%(M4) → 99,5%/98,8%/98,5%
  t HLM: -165,3(M1)/-53,1(M4) → -358,0/-128,8
  pkonfound OLS: 91,4%/92,5%/86,8% → 91,5%/93,5%/88,7%
  Δ pkonfound: 5,0–9,5pp → 5,4–9,7pp
  SE ratio OLS/HLM: 3,5–7× → 6–16×

CSVs atualizados: konfound_hlm.csv, konfound_hlm_vs_ols.csv,
  konfound_hlm_vs_ols.tex, sensibilidade_comparativa.csv

Co-Authored-By: Claude Sonnet 4.6 <noreply@anthropic.com>
</commit_message>
<xml_diff>
--- a/guia_estudo_defesa.docx
+++ b/guia_estudo_defesa.docx
@@ -2430,7 +2430,7 @@
           <w:i w:val="0"/>
           <w:sz w:val="22"/>
         </w:rPr>
-        <w:t>M1 (gap bruto) = 19,5%: sem nenhum controle.</w:t>
+        <w:t>M1 (gap bruto) = 19,3%: sem nenhum controle.</w:t>
       </w:r>
     </w:p>
     <w:p>
@@ -2478,7 +2478,7 @@
           <w:i w:val="0"/>
           <w:sz w:val="22"/>
         </w:rPr>
-        <w:t>M4 (+ CBO + formalidade + horas): o gap cai para 5,4% — este é o resíduo que não tem explicação por características observáveis. É a discriminação de remuneração pura.</w:t>
+        <w:t>M4 (+ CBO + formalidade + horas): o gap cai para 6,2% — este é o resíduo que não tem explicação por características observáveis. É a discriminação de remuneração pura.</w:t>
       </w:r>
     </w:p>
     <w:p>
@@ -2526,7 +2526,7 @@
           <w:i w:val="0"/>
           <w:sz w:val="22"/>
         </w:rPr>
-        <w:t>O gap residual de 5,4% em M4 não tem explicação por nenhuma variável observável: é o lower bound da discriminação de remuneração.</w:t>
+        <w:t>O gap residual de 6,2% em M4 não tem explicação por nenhuma variável observável: é o lower bound da discriminação de remuneração.</w:t>
       </w:r>
     </w:p>
     <w:p>
@@ -2556,7 +2556,7 @@
           <w:i w:val="0"/>
           <w:sz w:val="21"/>
         </w:rPr>
-        <w:t>'A sequência dos modelos não é arbitrária — cada passo adiciona um nível da hierarquia social. Primeiro o contexto de moradia (UPA), depois o contexto institucional (UF), depois a posição no mercado de trabalho (CBO + formalidade). O gap de 5,4% que sobra é robusto a todos os controles observáveis disponíveis na PNAD.'</w:t>
+        <w:t>'A sequência dos modelos não é arbitrária — cada passo adiciona um nível da hierarquia social. Primeiro o contexto de moradia (UPA), depois o contexto institucional (UF), depois a posição no mercado de trabalho (CBO + formalidade). O gap de 6,2% que sobra é robusto a todos os controles observáveis disponíveis na PNAD.'</w:t>
       </w:r>
     </w:p>
     <w:p/>
@@ -2764,7 +2764,7 @@
           <w:i w:val="0"/>
           <w:sz w:val="21"/>
         </w:rPr>
-        <w:t>'O Oaxaca une os três vértices do triângulo de evidências. Os 84% de dotações são explicados pelo logit (acesso a ocupações) e pela SNA (exclusão das redes). Os 16% de retornos são explicados pelo HLM M4 (5,4% de discriminação pura de remuneração). Os métodos são consistentes entre si.'</w:t>
+        <w:t>'O Oaxaca une os três vértices do triângulo de evidências. Os 84% de dotações são explicados pelo logit (acesso a ocupações) e pela SNA (exclusão das redes). Os 16% de retornos são explicados pelo HLM M4 (6,2% de discriminação pura de remuneração). Os métodos são consistentes entre si.'</w:t>
       </w:r>
     </w:p>
     <w:p>
@@ -3722,7 +3722,7 @@
           <w:i w:val="0"/>
           <w:sz w:val="21"/>
         </w:rPr>
-        <w:t>'A SNA adiciona uma dimensão que o HLM e o logit não capturam: o capital social estrutural. Mesmo que um negro consiga entrar em uma ocupação qualificada, sua betweenness=0 significa que ele não tem acesso às redes informais que geram promoção, mentoria e informação antecipada sobre vagas. Isso explica parte do gap residual de 5,4% do HLM M4.'</w:t>
+        <w:t>'A SNA adiciona uma dimensão que o HLM e o logit não capturam: o capital social estrutural. Mesmo que um negro consiga entrar em uma ocupação qualificada, sua betweenness=0 significa que ele não tem acesso às redes informais que geram promoção, mentoria e informação antecipada sobre vagas. Isso explica parte do gap residual de 6,2% do HLM M4.'</w:t>
       </w:r>
     </w:p>
     <w:p/>
@@ -5232,7 +5232,7 @@
           <w:i w:val="0"/>
           <w:sz w:val="22"/>
         </w:rPr>
-        <w:t>O interesse é em β₁: o gap racial líquido após todos os controles. Em M4, β₁ ≈ −0,054 (−5,4%). O sinal negativo confirma que negros ganham menos, tudo o mais constante.</w:t>
+        <w:t>O interesse é em β₁: o gap racial líquido após todos os controles. Em M4, β₁ ≈ −0,0644 (−6,2%). O sinal negativo confirma que negros ganham menos, tudo o mais constante.</w:t>
       </w:r>
     </w:p>
     <w:p>

</xml_diff>

<commit_message>
fix: corrige numeração de slides, valores QR/OR e adiciona seções ausentes no guia
- gerar_apresentacao_pptx.py: corrige 21 headers de slides (numeração sequencial
  1–23 alinhada com footers 2–24); corrige E-value OR=0,741→0,747 (M2)
- gerar_guia_estudo.py: corrige OB gap 52,6%→53,0%; OR GLMM 0,705→0,704 (×2);
  QR M4 valores q10≈-4%→-3,2%; q50≈-6,5%→-4,1%; q90≈-7,5%→-7,1%;
  adiciona seções RIF-OB (sticky floor), Interseccionalidade OB 4-grupos,
  Sensibilidade (Konfound/E-values/Oster), Heckman+Chow+Event Study COVID,
  e Pesquisa Operacional (TOPSIS/AHP/LP)
- Regenera apresentacao_tcc.pptx e guia_estudo_defesa.docx

Co-Authored-By: Claude Sonnet 4.6 <noreply@anthropic.com>
</commit_message>
<xml_diff>
--- a/guia_estudo_defesa.docx
+++ b/guia_estudo_defesa.docx
@@ -2654,7 +2654,7 @@
           <w:i w:val="0"/>
           <w:sz w:val="22"/>
         </w:rPr>
-        <w:t>O gráfico divide o gap total (≈52,6% em log-renda) em duas partes:</w:t>
+        <w:t>O gráfico divide o gap total (≈53,0% em log-renda) em duas partes:</w:t>
       </w:r>
     </w:p>
     <w:p>
@@ -2909,7 +2909,7 @@
           <w:i w:val="0"/>
           <w:sz w:val="22"/>
         </w:rPr>
-        <w:t>M1 (sem efeito aleatório de contexto): OR=0,705 — negros têm 29,6% menos chance. ICC M1=26,2% (variação entre UPAs elevada).</w:t>
+        <w:t>M1 (sem efeito aleatório de contexto): OR=0,704 — negros têm 29,6% menos chance. ICC M1=26,2% (variação entre UPAs elevada).</w:t>
       </w:r>
     </w:p>
     <w:p>
@@ -3228,7 +3228,7 @@
           <w:i w:val="0"/>
           <w:sz w:val="22"/>
         </w:rPr>
-        <w:t>Valores concretos: q10 ≈ −4%; q50 ≈ −6,5%; q90 ≈ −7,5%; q95 ≈ −7,9% (M4).</w:t>
+        <w:t>Valores concretos: q10 ≈ −3,2%; q50 ≈ −4,1%; q90 ≈ −7,1%; q95 ≈ −7,9% (M4).</w:t>
       </w:r>
     </w:p>
     <w:p>
@@ -3259,6 +3259,416 @@
           <w:sz w:val="21"/>
         </w:rPr>
         <w:t>'Um OLS capturaria apenas a média — aproximadamente o ponto de q50. Mas o glass ceiling está no q90–q95, onde o gap é sistematicamente maior. Sem regressão quantílica, esse padrão seria invisível. A regressão quantílica é o único método que formaliza a hipótese do glass ceiling como teste estatístico.'</w:t>
+      </w:r>
+    </w:p>
+    <w:p/>
+    <w:p>
+      <w:pPr>
+        <w:pStyle w:val="Heading2"/>
+      </w:pPr>
+      <w:r>
+        <w:rPr>
+          <w:rFonts w:ascii="Calibri" w:hAnsi="Calibri"/>
+          <w:color w:val="1F3864"/>
+        </w:rPr>
+        <w:t>Figura 9b — RIF-OB: Sticky Floor Discriminatório vs. Glass Ceiling por Dotações</w:t>
+      </w:r>
+    </w:p>
+    <w:p>
+      <w:pPr>
+        <w:jc w:val="center"/>
+      </w:pPr>
+      <w:r>
+        <w:drawing>
+          <wp:inline xmlns:a="http://schemas.openxmlformats.org/drawingml/2006/main" xmlns:pic="http://schemas.openxmlformats.org/drawingml/2006/picture">
+            <wp:extent cx="5040000" cy="3120203"/>
+            <wp:docPr id="9" name="Picture 9"/>
+            <wp:cNvGraphicFramePr>
+              <a:graphicFrameLocks noChangeAspect="1"/>
+            </wp:cNvGraphicFramePr>
+            <a:graphic>
+              <a:graphicData uri="http://schemas.openxmlformats.org/drawingml/2006/picture">
+                <pic:pic>
+                  <pic:nvPicPr>
+                    <pic:cNvPr id="0" name="rif_ob_retornos_quantis.png"/>
+                    <pic:cNvPicPr/>
+                  </pic:nvPicPr>
+                  <pic:blipFill>
+                    <a:blip r:embed="rId17"/>
+                    <a:stretch>
+                      <a:fillRect/>
+                    </a:stretch>
+                  </pic:blipFill>
+                  <pic:spPr>
+                    <a:xfrm>
+                      <a:off x="0" y="0"/>
+                      <a:ext cx="5040000" cy="3120203"/>
+                    </a:xfrm>
+                    <a:prstGeom prst="rect"/>
+                  </pic:spPr>
+                </pic:pic>
+              </a:graphicData>
+            </a:graphic>
+          </wp:inline>
+        </w:drawing>
+      </w:r>
+    </w:p>
+    <w:p>
+      <w:pPr>
+        <w:spacing w:after="200"/>
+        <w:jc w:val="center"/>
+      </w:pPr>
+      <w:r>
+        <w:rPr>
+          <w:i/>
+          <w:color w:val="606060"/>
+          <w:sz w:val="18"/>
+        </w:rPr>
+        <w:t>RIF-OB incondicional por quantil (Firpo, Fortin &amp; Lemieux, 2018). Retornos (discriminação) vs Dotações por decil de renda.</w:t>
+      </w:r>
+    </w:p>
+    <w:p>
+      <w:pPr>
+        <w:spacing w:before="80" w:after="120"/>
+        <w:jc w:val="left"/>
+      </w:pPr>
+      <w:r>
+        <w:rPr>
+          <w:rFonts w:ascii="Calibri" w:hAnsi="Calibri"/>
+          <w:b/>
+          <w:i w:val="0"/>
+          <w:color w:val="1F3864"/>
+          <w:sz w:val="22"/>
+        </w:rPr>
+        <w:t>Como ler:</w:t>
+      </w:r>
+    </w:p>
+    <w:p>
+      <w:pPr>
+        <w:pStyle w:val="ListBullet"/>
+        <w:spacing w:after="60"/>
+        <w:ind w:left="283"/>
+      </w:pPr>
+      <w:r>
+        <w:rPr>
+          <w:rFonts w:ascii="Calibri" w:hAnsi="Calibri"/>
+          <w:b w:val="0"/>
+          <w:i w:val="0"/>
+          <w:sz w:val="22"/>
+        </w:rPr>
+        <w:t>Eixo X: decil/quantil da distribuição incondicional de renda (q10=base, q90=topo).</w:t>
+      </w:r>
+    </w:p>
+    <w:p>
+      <w:pPr>
+        <w:pStyle w:val="ListBullet"/>
+        <w:spacing w:after="60"/>
+        <w:ind w:left="283"/>
+      </w:pPr>
+      <w:r>
+        <w:rPr>
+          <w:rFonts w:ascii="Calibri" w:hAnsi="Calibri"/>
+          <w:b w:val="0"/>
+          <w:i w:val="0"/>
+          <w:sz w:val="22"/>
+        </w:rPr>
+        <w:t>Dois componentes empilhados por quantil: Dotações (diferença de características) e Retornos (discriminação pura — o que persiste mesmo com características iguais).</w:t>
+      </w:r>
+    </w:p>
+    <w:p>
+      <w:pPr>
+        <w:pStyle w:val="ListBullet"/>
+        <w:spacing w:after="60"/>
+        <w:ind w:left="283"/>
+      </w:pPr>
+      <w:r>
+        <w:rPr>
+          <w:rFonts w:ascii="Calibri" w:hAnsi="Calibri"/>
+          <w:b w:val="0"/>
+          <w:i w:val="0"/>
+          <w:sz w:val="22"/>
+        </w:rPr>
+        <w:t>RIF = Recentered Influence Function — permite decompor o gap em qualquer quantil incondicionalmente, sem condicionar ao quantil dentro de cada grupo racial.</w:t>
+      </w:r>
+    </w:p>
+    <w:p>
+      <w:pPr>
+        <w:spacing w:before="80" w:after="120"/>
+        <w:jc w:val="left"/>
+      </w:pPr>
+      <w:r>
+        <w:rPr>
+          <w:rFonts w:ascii="Calibri" w:hAnsi="Calibri"/>
+          <w:b/>
+          <w:i w:val="0"/>
+          <w:color w:val="1F3864"/>
+          <w:sz w:val="22"/>
+        </w:rPr>
+        <w:t>O padrão sticky floor vs. glass ceiling:</w:t>
+      </w:r>
+    </w:p>
+    <w:p>
+      <w:pPr>
+        <w:pStyle w:val="ListBullet"/>
+        <w:spacing w:after="60"/>
+        <w:ind w:left="283"/>
+      </w:pPr>
+      <w:r>
+        <w:rPr>
+          <w:rFonts w:ascii="Calibri" w:hAnsi="Calibri"/>
+          <w:b w:val="0"/>
+          <w:i w:val="0"/>
+          <w:sz w:val="22"/>
+        </w:rPr>
+        <w:t>q10 — base: Dotações=61,3%, Retornos=33,1%. Discriminação de preço é 3× mais intensa na BASE — efeito sticky floor (chão pegajoso).</w:t>
+      </w:r>
+    </w:p>
+    <w:p>
+      <w:pPr>
+        <w:pStyle w:val="ListBullet"/>
+        <w:spacing w:after="60"/>
+        <w:ind w:left="283"/>
+      </w:pPr>
+      <w:r>
+        <w:rPr>
+          <w:rFonts w:ascii="Calibri" w:hAnsi="Calibri"/>
+          <w:b w:val="0"/>
+          <w:i w:val="0"/>
+          <w:sz w:val="22"/>
+        </w:rPr>
+        <w:t>q50 — mediana: Dotações=57,4%, Retornos=21,5%. Discriminação decai progressivamente.</w:t>
+      </w:r>
+    </w:p>
+    <w:p>
+      <w:pPr>
+        <w:pStyle w:val="ListBullet"/>
+        <w:spacing w:after="60"/>
+        <w:ind w:left="283"/>
+      </w:pPr>
+      <w:r>
+        <w:rPr>
+          <w:rFonts w:ascii="Calibri" w:hAnsi="Calibri"/>
+          <w:b w:val="0"/>
+          <w:i w:val="0"/>
+          <w:sz w:val="22"/>
+        </w:rPr>
+        <w:t>q90 — topo: Dotações=75,8%, Retornos=11,2%. No topo, o gap é quase inteiramente por dotações — negros são EXCLUÍDOS das posições rentáveis (glass ceiling).</w:t>
+      </w:r>
+    </w:p>
+    <w:p>
+      <w:pPr>
+        <w:spacing w:before="80" w:after="40"/>
+      </w:pPr>
+      <w:r>
+        <w:rPr>
+          <w:rFonts w:ascii="Calibri" w:hAnsi="Calibri"/>
+          <w:b/>
+          <w:i w:val="0"/>
+          <w:color w:val="2E7D32"/>
+          <w:sz w:val="22"/>
+        </w:rPr>
+        <w:t>▌ O que dizer se perguntarem:</w:t>
+      </w:r>
+    </w:p>
+    <w:p>
+      <w:pPr>
+        <w:spacing w:after="40"/>
+        <w:ind w:left="454"/>
+      </w:pPr>
+      <w:r>
+        <w:rPr>
+          <w:rFonts w:ascii="Calibri" w:hAnsi="Calibri"/>
+          <w:b w:val="0"/>
+          <w:i w:val="0"/>
+          <w:sz w:val="21"/>
+        </w:rPr>
+        <w:t>'A QR formaliza o glass ceiling condicional — o gap cresce no topo dentro de cada grupo. O RIF-OB faz a decomposição incondicional — permite perguntar: de onde vem esse gap maior no topo? A resposta é: no topo o mecanismo dominante é exclusão (dotações = 75,8%), não discriminação salarial direta. Na base, a discriminação de preço ainda responde por 33,1% do gap — o sticky floor discriminatório. São dois fenômenos distintos que coexistem.'</w:t>
+      </w:r>
+    </w:p>
+    <w:p/>
+    <w:p>
+      <w:pPr>
+        <w:pStyle w:val="Heading2"/>
+      </w:pPr>
+      <w:r>
+        <w:rPr>
+          <w:rFonts w:ascii="Calibri" w:hAnsi="Calibri"/>
+          <w:color w:val="1F3864"/>
+        </w:rPr>
+        <w:t>Figura 9c — Interseccionalidade: Oaxaca-Blinder por 4 Grupos Raça × Gênero</w:t>
+      </w:r>
+    </w:p>
+    <w:p>
+      <w:pPr>
+        <w:spacing w:before="80" w:after="120"/>
+        <w:jc w:val="left"/>
+      </w:pPr>
+      <w:r>
+        <w:rPr>
+          <w:rFonts w:ascii="Calibri" w:hAnsi="Calibri"/>
+          <w:b/>
+          <w:i w:val="0"/>
+          <w:color w:val="1F3864"/>
+          <w:sz w:val="22"/>
+        </w:rPr>
+        <w:t>Como ler:</w:t>
+      </w:r>
+    </w:p>
+    <w:p>
+      <w:pPr>
+        <w:pStyle w:val="ListBullet"/>
+        <w:spacing w:after="60"/>
+        <w:ind w:left="283"/>
+      </w:pPr>
+      <w:r>
+        <w:rPr>
+          <w:rFonts w:ascii="Calibri" w:hAnsi="Calibri"/>
+          <w:b w:val="0"/>
+          <w:i w:val="0"/>
+          <w:sz w:val="22"/>
+        </w:rPr>
+        <w:t>Referência: Homem Branco. Comparação: Mulher Branca, Homem Negro, Mulher Negra.</w:t>
+      </w:r>
+    </w:p>
+    <w:p>
+      <w:pPr>
+        <w:pStyle w:val="ListBullet"/>
+        <w:spacing w:after="60"/>
+        <w:ind w:left="283"/>
+      </w:pPr>
+      <w:r>
+        <w:rPr>
+          <w:rFonts w:ascii="Calibri" w:hAnsi="Calibri"/>
+          <w:b w:val="0"/>
+          <w:i w:val="0"/>
+          <w:sz w:val="22"/>
+        </w:rPr>
+        <w:t>Para cada grupo, o gap total é decomposto em Dotações (características) e Retornos (discriminação direta).</w:t>
+      </w:r>
+    </w:p>
+    <w:p>
+      <w:pPr>
+        <w:pStyle w:val="ListBullet"/>
+        <w:spacing w:after="60"/>
+        <w:ind w:left="283"/>
+      </w:pPr>
+      <w:r>
+        <w:rPr>
+          <w:rFonts w:ascii="Calibri" w:hAnsi="Calibri"/>
+          <w:b w:val="0"/>
+          <w:i w:val="0"/>
+          <w:sz w:val="22"/>
+        </w:rPr>
+        <w:t>HLM M4: coeficiente da interação negro×sexo_fem = β=+0,069 — indica atenuação do gap racial para mulheres (raça e gênero interagem, não se somam linearmente).</w:t>
+      </w:r>
+    </w:p>
+    <w:p>
+      <w:pPr>
+        <w:spacing w:before="80" w:after="120"/>
+        <w:jc w:val="left"/>
+      </w:pPr>
+      <w:r>
+        <w:rPr>
+          <w:rFonts w:ascii="Calibri" w:hAnsi="Calibri"/>
+          <w:b/>
+          <w:i w:val="0"/>
+          <w:color w:val="1F3864"/>
+          <w:sz w:val="22"/>
+        </w:rPr>
+        <w:t>Resultados por grupo (referência: Homem Branco):</w:t>
+      </w:r>
+    </w:p>
+    <w:p>
+      <w:pPr>
+        <w:pStyle w:val="ListBullet"/>
+        <w:spacing w:after="60"/>
+        <w:ind w:left="283"/>
+      </w:pPr>
+      <w:r>
+        <w:rPr>
+          <w:rFonts w:ascii="Calibri" w:hAnsi="Calibri"/>
+          <w:b w:val="0"/>
+          <w:i w:val="0"/>
+          <w:sz w:val="22"/>
+        </w:rPr>
+        <w:t>Mulher Branca: gap=46,6% — 79% dotações / 109% retornos (retornos negativos, indicando discriminação de gênero pura). Sem penalidade de raça.</w:t>
+      </w:r>
+    </w:p>
+    <w:p>
+      <w:pPr>
+        <w:pStyle w:val="ListBullet"/>
+        <w:spacing w:after="60"/>
+        <w:ind w:left="283"/>
+      </w:pPr>
+      <w:r>
+        <w:rPr>
+          <w:rFonts w:ascii="Calibri" w:hAnsi="Calibri"/>
+          <w:b w:val="0"/>
+          <w:i w:val="0"/>
+          <w:sz w:val="22"/>
+        </w:rPr>
+        <w:t>Homem Negro: gap=40,3% — 71% dotações / 29% retornos. Discriminação racial direta explica ~29% do gap do homem negro.</w:t>
+      </w:r>
+    </w:p>
+    <w:p>
+      <w:pPr>
+        <w:pStyle w:val="ListBullet"/>
+        <w:spacing w:after="60"/>
+        <w:ind w:left="283"/>
+      </w:pPr>
+      <w:r>
+        <w:rPr>
+          <w:rFonts w:ascii="Calibri" w:hAnsi="Calibri"/>
+          <w:b w:val="0"/>
+          <w:i w:val="0"/>
+          <w:sz w:val="22"/>
+        </w:rPr>
+        <w:t>Mulher Negra: gap=96,4% — maior gap de todos os grupos. Penalidade adicional por interseccionalidade: +9,5 p.p. além da soma de raça + gênero separados.</w:t>
+      </w:r>
+    </w:p>
+    <w:p>
+      <w:pPr>
+        <w:spacing w:before="80" w:after="40"/>
+      </w:pPr>
+      <w:r>
+        <w:rPr>
+          <w:rFonts w:ascii="Calibri" w:hAnsi="Calibri"/>
+          <w:b/>
+          <w:i w:val="0"/>
+          <w:color w:val="FF8F00"/>
+          <w:sz w:val="22"/>
+        </w:rPr>
+        <w:t>▌ O que dizer se perguntarem sobre interseccionalidade:</w:t>
+      </w:r>
+    </w:p>
+    <w:p>
+      <w:pPr>
+        <w:spacing w:after="40"/>
+        <w:ind w:left="454"/>
+      </w:pPr>
+      <w:r>
+        <w:rPr>
+          <w:rFonts w:ascii="Calibri" w:hAnsi="Calibri"/>
+          <w:b w:val="0"/>
+          <w:i w:val="0"/>
+          <w:sz w:val="21"/>
+        </w:rPr>
+        <w:t>'A Mulher Negra não sofre apenas raça + gênero de forma aditiva — existe uma penalidade adicional de +9,5 p.p. que emerge especificamente da combinação dos dois eixos de opressão. Isso é a interseccionalidade no sentido de Crenshaw (1989): os eixos interagem, não se somam. O HLM confirma com β_neg×fem=+0,069 (***) — a discriminação racial é estatisticamente menor para mulheres negras do que se esperaria da soma linear.'</w:t>
+      </w:r>
+    </w:p>
+    <w:p>
+      <w:pPr>
+        <w:spacing w:after="40"/>
+        <w:ind w:left="454"/>
+      </w:pPr>
+      <w:r>
+        <w:rPr>
+          <w:rFonts w:ascii="Calibri" w:hAnsi="Calibri"/>
+          <w:b w:val="0"/>
+          <w:i w:val="0"/>
+          <w:sz w:val="21"/>
+        </w:rPr>
+        <w:t>'Gap de 96,4% para mulher negra vs 40,3% para homem negro: a mulher negra experimenta uma dupla desvantagem que quase dobra o gap. Políticas de gênero e raça precisam ser desenhadas conjuntamente para esse grupo.'</w:t>
       </w:r>
     </w:p>
     <w:p/>
@@ -3282,7 +3692,7 @@
         <w:drawing>
           <wp:inline xmlns:a="http://schemas.openxmlformats.org/drawingml/2006/main" xmlns:pic="http://schemas.openxmlformats.org/drawingml/2006/picture">
             <wp:extent cx="5040000" cy="3736625"/>
-            <wp:docPr id="9" name="Picture 9"/>
+            <wp:docPr id="10" name="Picture 10"/>
             <wp:cNvGraphicFramePr>
               <a:graphicFrameLocks noChangeAspect="1"/>
             </wp:cNvGraphicFramePr>
@@ -3294,7 +3704,7 @@
                     <pic:cNvPicPr/>
                   </pic:nvPicPr>
                   <pic:blipFill>
-                    <a:blip r:embed="rId17"/>
+                    <a:blip r:embed="rId18"/>
                     <a:stretch>
                       <a:fillRect/>
                     </a:stretch>
@@ -3522,7 +3932,7 @@
         <w:drawing>
           <wp:inline xmlns:a="http://schemas.openxmlformats.org/drawingml/2006/main" xmlns:pic="http://schemas.openxmlformats.org/drawingml/2006/picture">
             <wp:extent cx="5040000" cy="3769412"/>
-            <wp:docPr id="10" name="Picture 10"/>
+            <wp:docPr id="11" name="Picture 11"/>
             <wp:cNvGraphicFramePr>
               <a:graphicFrameLocks noChangeAspect="1"/>
             </wp:cNvGraphicFramePr>
@@ -3534,7 +3944,7 @@
                     <pic:cNvPicPr/>
                   </pic:nvPicPr>
                   <pic:blipFill>
-                    <a:blip r:embed="rId18"/>
+                    <a:blip r:embed="rId19"/>
                     <a:stretch>
                       <a:fillRect/>
                     </a:stretch>
@@ -3746,7 +4156,7 @@
         <w:drawing>
           <wp:inline xmlns:a="http://schemas.openxmlformats.org/drawingml/2006/main" xmlns:pic="http://schemas.openxmlformats.org/drawingml/2006/picture">
             <wp:extent cx="5040000" cy="2121282"/>
-            <wp:docPr id="11" name="Picture 11"/>
+            <wp:docPr id="12" name="Picture 12"/>
             <wp:cNvGraphicFramePr>
               <a:graphicFrameLocks noChangeAspect="1"/>
             </wp:cNvGraphicFramePr>
@@ -3758,7 +4168,7 @@
                     <pic:cNvPicPr/>
                   </pic:nvPicPr>
                   <pic:blipFill>
-                    <a:blip r:embed="rId19"/>
+                    <a:blip r:embed="rId20"/>
                     <a:stretch>
                       <a:fillRect/>
                     </a:stretch>
@@ -3924,7 +4334,7 @@
         <w:drawing>
           <wp:inline xmlns:a="http://schemas.openxmlformats.org/drawingml/2006/main" xmlns:pic="http://schemas.openxmlformats.org/drawingml/2006/picture">
             <wp:extent cx="5040000" cy="2123888"/>
-            <wp:docPr id="12" name="Picture 12"/>
+            <wp:docPr id="13" name="Picture 13"/>
             <wp:cNvGraphicFramePr>
               <a:graphicFrameLocks noChangeAspect="1"/>
             </wp:cNvGraphicFramePr>
@@ -3936,7 +4346,7 @@
                     <pic:cNvPicPr/>
                   </pic:nvPicPr>
                   <pic:blipFill>
-                    <a:blip r:embed="rId20"/>
+                    <a:blip r:embed="rId21"/>
                     <a:stretch>
                       <a:fillRect/>
                     </a:stretch>
@@ -4118,7 +4528,7 @@
         <w:drawing>
           <wp:inline xmlns:a="http://schemas.openxmlformats.org/drawingml/2006/main" xmlns:pic="http://schemas.openxmlformats.org/drawingml/2006/picture">
             <wp:extent cx="5040000" cy="2122380"/>
-            <wp:docPr id="13" name="Picture 13"/>
+            <wp:docPr id="14" name="Picture 14"/>
             <wp:cNvGraphicFramePr>
               <a:graphicFrameLocks noChangeAspect="1"/>
             </wp:cNvGraphicFramePr>
@@ -4130,7 +4540,7 @@
                     <pic:cNvPicPr/>
                   </pic:nvPicPr>
                   <pic:blipFill>
-                    <a:blip r:embed="rId21"/>
+                    <a:blip r:embed="rId22"/>
                     <a:stretch>
                       <a:fillRect/>
                     </a:stretch>
@@ -4328,7 +4738,7 @@
         <w:drawing>
           <wp:inline xmlns:a="http://schemas.openxmlformats.org/drawingml/2006/main" xmlns:pic="http://schemas.openxmlformats.org/drawingml/2006/picture">
             <wp:extent cx="5040000" cy="2117581"/>
-            <wp:docPr id="14" name="Picture 14"/>
+            <wp:docPr id="15" name="Picture 15"/>
             <wp:cNvGraphicFramePr>
               <a:graphicFrameLocks noChangeAspect="1"/>
             </wp:cNvGraphicFramePr>
@@ -4340,7 +4750,7 @@
                     <pic:cNvPicPr/>
                   </pic:nvPicPr>
                   <pic:blipFill>
-                    <a:blip r:embed="rId22"/>
+                    <a:blip r:embed="rId23"/>
                     <a:stretch>
                       <a:fillRect/>
                     </a:stretch>
@@ -4506,7 +4916,7 @@
         <w:drawing>
           <wp:inline xmlns:a="http://schemas.openxmlformats.org/drawingml/2006/main" xmlns:pic="http://schemas.openxmlformats.org/drawingml/2006/picture">
             <wp:extent cx="5040000" cy="2120041"/>
-            <wp:docPr id="15" name="Picture 15"/>
+            <wp:docPr id="16" name="Picture 16"/>
             <wp:cNvGraphicFramePr>
               <a:graphicFrameLocks noChangeAspect="1"/>
             </wp:cNvGraphicFramePr>
@@ -4518,7 +4928,7 @@
                     <pic:cNvPicPr/>
                   </pic:nvPicPr>
                   <pic:blipFill>
-                    <a:blip r:embed="rId23"/>
+                    <a:blip r:embed="rId24"/>
                     <a:stretch>
                       <a:fillRect/>
                     </a:stretch>
@@ -4716,7 +5126,7 @@
         <w:drawing>
           <wp:inline xmlns:a="http://schemas.openxmlformats.org/drawingml/2006/main" xmlns:pic="http://schemas.openxmlformats.org/drawingml/2006/picture">
             <wp:extent cx="5040000" cy="2151338"/>
-            <wp:docPr id="16" name="Picture 16"/>
+            <wp:docPr id="17" name="Picture 17"/>
             <wp:cNvGraphicFramePr>
               <a:graphicFrameLocks noChangeAspect="1"/>
             </wp:cNvGraphicFramePr>
@@ -4728,7 +5138,7 @@
                     <pic:cNvPicPr/>
                   </pic:nvPicPr>
                   <pic:blipFill>
-                    <a:blip r:embed="rId24"/>
+                    <a:blip r:embed="rId25"/>
                     <a:stretch>
                       <a:fillRect/>
                     </a:stretch>
@@ -4910,7 +5320,7 @@
         <w:drawing>
           <wp:inline xmlns:a="http://schemas.openxmlformats.org/drawingml/2006/main" xmlns:pic="http://schemas.openxmlformats.org/drawingml/2006/picture">
             <wp:extent cx="5040000" cy="1938059"/>
-            <wp:docPr id="17" name="Picture 17"/>
+            <wp:docPr id="18" name="Picture 18"/>
             <wp:cNvGraphicFramePr>
               <a:graphicFrameLocks noChangeAspect="1"/>
             </wp:cNvGraphicFramePr>
@@ -4922,7 +5332,7 @@
                     <pic:cNvPicPr/>
                   </pic:nvPicPr>
                   <pic:blipFill>
-                    <a:blip r:embed="rId25"/>
+                    <a:blip r:embed="rId26"/>
                     <a:stretch>
                       <a:fillRect/>
                     </a:stretch>
@@ -5099,6 +5509,645 @@
     </w:p>
     <w:p/>
     <w:p>
+      <w:pPr>
+        <w:pStyle w:val="Heading2"/>
+      </w:pPr>
+      <w:r>
+        <w:rPr>
+          <w:rFonts w:ascii="Calibri" w:hAnsi="Calibri"/>
+          <w:color w:val="1F3864"/>
+        </w:rPr>
+        <w:t>Análises de Sensibilidade — Konfound, E-values e Oster δ*</w:t>
+      </w:r>
+    </w:p>
+    <w:p>
+      <w:pPr>
+        <w:spacing w:before="80" w:after="120"/>
+        <w:jc w:val="left"/>
+      </w:pPr>
+      <w:r>
+        <w:rPr>
+          <w:rFonts w:ascii="Calibri" w:hAnsi="Calibri"/>
+          <w:b/>
+          <w:i w:val="0"/>
+          <w:color w:val="1F3864"/>
+          <w:sz w:val="22"/>
+        </w:rPr>
+        <w:t>Como ler:</w:t>
+      </w:r>
+    </w:p>
+    <w:p>
+      <w:pPr>
+        <w:pStyle w:val="ListBullet"/>
+        <w:spacing w:after="60"/>
+        <w:ind w:left="283"/>
+      </w:pPr>
+      <w:r>
+        <w:rPr>
+          <w:rFonts w:ascii="Calibri" w:hAnsi="Calibri"/>
+          <w:b w:val="0"/>
+          <w:i w:val="0"/>
+          <w:sz w:val="22"/>
+        </w:rPr>
+        <w:t>Konfound (pkonfound): quantos casos precisariam ser trocados de trat./controle, ou qual % dos casos precisaria estar mal alocado, para reverter a conclusão. Quanto maior, mais robusto.</w:t>
+      </w:r>
+    </w:p>
+    <w:p>
+      <w:pPr>
+        <w:pStyle w:val="ListBullet"/>
+        <w:spacing w:after="60"/>
+        <w:ind w:left="283"/>
+      </w:pPr>
+      <w:r>
+        <w:rPr>
+          <w:rFonts w:ascii="Calibri" w:hAnsi="Calibri"/>
+          <w:b w:val="0"/>
+          <w:i w:val="0"/>
+          <w:sz w:val="22"/>
+        </w:rPr>
+        <w:t>E-value (VanderWeele &amp; Ding, 2017): qual a magnitude mínima de uma variável omitida (como razão de risco) para anular o efeito observado. E-value ≥ 2 indica boa resistência.</w:t>
+      </w:r>
+    </w:p>
+    <w:p>
+      <w:pPr>
+        <w:pStyle w:val="ListBullet"/>
+        <w:spacing w:after="60"/>
+        <w:ind w:left="283"/>
+      </w:pPr>
+      <w:r>
+        <w:rPr>
+          <w:rFonts w:ascii="Calibri" w:hAnsi="Calibri"/>
+          <w:b w:val="0"/>
+          <w:i w:val="0"/>
+          <w:sz w:val="22"/>
+        </w:rPr>
+        <w:t>Oster δ*: qual proporção da variação total dos controles observados seria necessária nos não-observados para anular o efeito. δ* negativo confirma robustez (variáveis omitidas teriam que atuar na direção contrária).</w:t>
+      </w:r>
+    </w:p>
+    <w:p>
+      <w:pPr>
+        <w:spacing w:before="80" w:after="120"/>
+        <w:jc w:val="left"/>
+      </w:pPr>
+      <w:r>
+        <w:rPr>
+          <w:rFonts w:ascii="Calibri" w:hAnsi="Calibri"/>
+          <w:b/>
+          <w:i w:val="0"/>
+          <w:color w:val="1F3864"/>
+          <w:sz w:val="22"/>
+        </w:rPr>
+        <w:t>Resultados:</w:t>
+      </w:r>
+    </w:p>
+    <w:p>
+      <w:pPr>
+        <w:pStyle w:val="ListBullet"/>
+        <w:spacing w:after="60"/>
+        <w:ind w:left="283"/>
+      </w:pPr>
+      <w:r>
+        <w:rPr>
+          <w:rFonts w:ascii="Calibri" w:hAnsi="Calibri"/>
+          <w:b w:val="0"/>
+          <w:i w:val="0"/>
+          <w:sz w:val="22"/>
+        </w:rPr>
+        <w:t>Konfound HLM: M1=99,5%; M2=M3=98,8%; M4=98,5% — quase 100% dos casos precisariam ser mal alocados para reverter a conclusão de discriminação.</w:t>
+      </w:r>
+    </w:p>
+    <w:p>
+      <w:pPr>
+        <w:pStyle w:val="ListBullet"/>
+        <w:spacing w:after="60"/>
+        <w:ind w:left="283"/>
+      </w:pPr>
+      <w:r>
+        <w:rPr>
+          <w:rFonts w:ascii="Calibri" w:hAnsi="Calibri"/>
+          <w:b w:val="0"/>
+          <w:i w:val="0"/>
+          <w:sz w:val="22"/>
+        </w:rPr>
+        <w:t>OLS subestima: gap OLS=43,8%–48,5% vs HLM=50,8%–53,0% (Δ=5,4–9,7 p.p.) — o viés de subestimação do OLS fica em torno de 9,7 p.p. em M1 e 5,4 p.p. em M4.</w:t>
+      </w:r>
+    </w:p>
+    <w:p>
+      <w:pPr>
+        <w:pStyle w:val="ListBullet"/>
+        <w:spacing w:after="60"/>
+        <w:ind w:left="283"/>
+      </w:pPr>
+      <w:r>
+        <w:rPr>
+          <w:rFonts w:ascii="Calibri" w:hAnsi="Calibri"/>
+          <w:b w:val="0"/>
+          <w:i w:val="0"/>
+          <w:sz w:val="22"/>
+        </w:rPr>
+        <w:t>E-values GLMM: M1=2,174; M2=2,038 — variável omitida precisaria ter associação 2,0–2,2× com raça E com acesso a ocupações para eliminar o OR.</w:t>
+      </w:r>
+    </w:p>
+    <w:p>
+      <w:pPr>
+        <w:pStyle w:val="ListBullet"/>
+        <w:spacing w:after="60"/>
+        <w:ind w:left="283"/>
+      </w:pPr>
+      <w:r>
+        <w:rPr>
+          <w:rFonts w:ascii="Calibri" w:hAnsi="Calibri"/>
+          <w:b w:val="0"/>
+          <w:i w:val="0"/>
+          <w:sz w:val="22"/>
+        </w:rPr>
+        <w:t>Oster δ*: M1=−0,48; M2=−0,43; M4=−0,39 — todos negativos, confirmando que variáveis omitidas teriam que atenuar (não amplificar) para anular o gap.</w:t>
+      </w:r>
+    </w:p>
+    <w:p>
+      <w:pPr>
+        <w:spacing w:before="80" w:after="40"/>
+      </w:pPr>
+      <w:r>
+        <w:rPr>
+          <w:rFonts w:ascii="Calibri" w:hAnsi="Calibri"/>
+          <w:b/>
+          <w:i w:val="0"/>
+          <w:color w:val="2E7D32"/>
+          <w:sz w:val="22"/>
+        </w:rPr>
+        <w:t>▌ O que dizer se perguntarem sobre endogeneidade ou variáveis omitidas:</w:t>
+      </w:r>
+    </w:p>
+    <w:p>
+      <w:pPr>
+        <w:spacing w:after="40"/>
+        <w:ind w:left="454"/>
+      </w:pPr>
+      <w:r>
+        <w:rPr>
+          <w:rFonts w:ascii="Calibri" w:hAnsi="Calibri"/>
+          <w:b w:val="0"/>
+          <w:i w:val="0"/>
+          <w:sz w:val="21"/>
+        </w:rPr>
+        <w:t>'Testei três frameworks de sensibilidade independentes. O pkonfound mostra que seria necessário reclassificar ~99% das observações para reverter a conclusão — impossível dado o N=7,7 milhões. O E-value ≥2,0 exige que uma variável omitida tenha associação dobrada com raça E com renda simultaneamente — sem candidato plausível. E o Oster δ* negativo significa que a seleção nas variáveis omitidas teria que ser na direção oposta à seleção observada. Os três convergem: o resultado é robusto.'</w:t>
+      </w:r>
+    </w:p>
+    <w:p/>
+    <w:p>
+      <w:pPr>
+        <w:pStyle w:val="Heading2"/>
+      </w:pPr>
+      <w:r>
+        <w:rPr>
+          <w:rFonts w:ascii="Calibri" w:hAnsi="Calibri"/>
+          <w:color w:val="1F3864"/>
+        </w:rPr>
+        <w:t>Análises Complementares — Heckman, Tendência Temporal e Event Study COVID</w:t>
+      </w:r>
+    </w:p>
+    <w:p>
+      <w:pPr>
+        <w:spacing w:before="80" w:after="120"/>
+        <w:jc w:val="left"/>
+      </w:pPr>
+      <w:r>
+        <w:rPr>
+          <w:rFonts w:ascii="Calibri" w:hAnsi="Calibri"/>
+          <w:b/>
+          <w:i w:val="0"/>
+          <w:color w:val="1F3864"/>
+          <w:sz w:val="22"/>
+        </w:rPr>
+        <w:t>Correção de Seleção Amostral (Heckman):</w:t>
+      </w:r>
+    </w:p>
+    <w:p>
+      <w:pPr>
+        <w:pStyle w:val="ListBullet"/>
+        <w:spacing w:after="60"/>
+        <w:ind w:left="283"/>
+      </w:pPr>
+      <w:r>
+        <w:rPr>
+          <w:rFonts w:ascii="Calibri" w:hAnsi="Calibri"/>
+          <w:b w:val="0"/>
+          <w:i w:val="0"/>
+          <w:sz w:val="22"/>
+        </w:rPr>
+        <w:t>Problema: analisamos apenas quem tem renda (PEA ocupada). A seleção para participar do mercado de trabalho pode ser endógena — se negros participam menos, o gap observado é subestimado.</w:t>
+      </w:r>
+    </w:p>
+    <w:p>
+      <w:pPr>
+        <w:pStyle w:val="ListBullet"/>
+        <w:spacing w:after="60"/>
+        <w:ind w:left="283"/>
+      </w:pPr>
+      <w:r>
+        <w:rPr>
+          <w:rFonts w:ascii="Calibri" w:hAnsi="Calibri"/>
+          <w:b w:val="0"/>
+          <w:i w:val="0"/>
+          <w:sz w:val="22"/>
+        </w:rPr>
+        <w:t>Modelo de seleção (Probit 1ª etapa): educação, idade, número de filhos, presença de cônjuge → gera lambda de Mills (λ).</w:t>
+      </w:r>
+    </w:p>
+    <w:p>
+      <w:pPr>
+        <w:pStyle w:val="ListBullet"/>
+        <w:spacing w:after="60"/>
+        <w:ind w:left="283"/>
+      </w:pPr>
+      <w:r>
+        <w:rPr>
+          <w:rFonts w:ascii="Calibri" w:hAnsi="Calibri"/>
+          <w:b w:val="0"/>
+          <w:i w:val="0"/>
+          <w:sz w:val="22"/>
+        </w:rPr>
+        <w:t>Resultado: λ=−1,985 (***) — seleção amostral significativa e negativa. Gap OLS=−9,71% → Gap Heckman=−7,41% (Δ=+2,3 p.p.): o gap bruto estava SUBESTIMADO; negros mais excluídos do mercado atenuavam o gap aparente.</w:t>
+      </w:r>
+    </w:p>
+    <w:p>
+      <w:pPr>
+        <w:spacing w:before="80" w:after="120"/>
+        <w:jc w:val="left"/>
+      </w:pPr>
+      <w:r>
+        <w:rPr>
+          <w:rFonts w:ascii="Calibri" w:hAnsi="Calibri"/>
+          <w:b/>
+          <w:i w:val="0"/>
+          <w:color w:val="1F3864"/>
+          <w:sz w:val="22"/>
+        </w:rPr>
+        <w:t>Tendência Temporal e Teste de Chow:</w:t>
+      </w:r>
+    </w:p>
+    <w:p>
+      <w:pPr>
+        <w:pStyle w:val="ListBullet"/>
+        <w:spacing w:after="60"/>
+        <w:ind w:left="283"/>
+      </w:pPr>
+      <w:r>
+        <w:rPr>
+          <w:rFonts w:ascii="Calibri" w:hAnsi="Calibri"/>
+          <w:b w:val="0"/>
+          <w:i w:val="0"/>
+          <w:sz w:val="22"/>
+        </w:rPr>
+        <w:t>Gap anual estimado: a discriminação racial mantém-se estável ao longo do período (tendência linear δ=0,0008/ano, não significativa).</w:t>
+      </w:r>
+    </w:p>
+    <w:p>
+      <w:pPr>
+        <w:pStyle w:val="ListBullet"/>
+        <w:spacing w:after="60"/>
+        <w:ind w:left="283"/>
+      </w:pPr>
+      <w:r>
+        <w:rPr>
+          <w:rFonts w:ascii="Calibri" w:hAnsi="Calibri"/>
+          <w:b w:val="0"/>
+          <w:i w:val="0"/>
+          <w:sz w:val="22"/>
+        </w:rPr>
+        <w:t>Teste de Chow (2020): F(2,6)=7,012; p=0,027 — quebra estrutural significativa em 2020 (pandemia). O gap racial NÃO teve convergência pré-COVID.</w:t>
+      </w:r>
+    </w:p>
+    <w:p>
+      <w:pPr>
+        <w:spacing w:before="80" w:after="120"/>
+        <w:jc w:val="left"/>
+      </w:pPr>
+      <w:r>
+        <w:rPr>
+          <w:rFonts w:ascii="Calibri" w:hAnsi="Calibri"/>
+          <w:b/>
+          <w:i w:val="0"/>
+          <w:color w:val="1F3864"/>
+          <w:sz w:val="22"/>
+        </w:rPr>
+        <w:t>Event Study COVID (DiD):</w:t>
+      </w:r>
+    </w:p>
+    <w:p>
+      <w:pPr>
+        <w:pStyle w:val="ListBullet"/>
+        <w:spacing w:after="60"/>
+        <w:ind w:left="283"/>
+      </w:pPr>
+      <w:r>
+        <w:rPr>
+          <w:rFonts w:ascii="Calibri" w:hAnsi="Calibri"/>
+          <w:b w:val="0"/>
+          <w:i w:val="0"/>
+          <w:sz w:val="22"/>
+        </w:rPr>
+        <w:t>Tratamento: pós-2020 (COVID). Estimativa: τ=+0,015; SE=0,007; p=0,025.</w:t>
+      </w:r>
+    </w:p>
+    <w:p>
+      <w:pPr>
+        <w:pStyle w:val="ListBullet"/>
+        <w:spacing w:after="60"/>
+        <w:ind w:left="283"/>
+      </w:pPr>
+      <w:r>
+        <w:rPr>
+          <w:rFonts w:ascii="Calibri" w:hAnsi="Calibri"/>
+          <w:b w:val="0"/>
+          <w:i w:val="0"/>
+          <w:sz w:val="22"/>
+        </w:rPr>
+        <w:t>Interpretação: a pandemia AMPLIOU o gap racial em 1,5 p.p. de log-renda — negros foram desproporcionalmente afetados pelo choque COVID.</w:t>
+      </w:r>
+    </w:p>
+    <w:p>
+      <w:pPr>
+        <w:spacing w:before="80" w:after="40"/>
+      </w:pPr>
+      <w:r>
+        <w:rPr>
+          <w:rFonts w:ascii="Calibri" w:hAnsi="Calibri"/>
+          <w:b/>
+          <w:i w:val="0"/>
+          <w:color w:val="1F3864"/>
+          <w:sz w:val="22"/>
+        </w:rPr>
+        <w:t>▌ O que dizer se perguntarem sobre essas análises:</w:t>
+      </w:r>
+    </w:p>
+    <w:p>
+      <w:pPr>
+        <w:spacing w:after="40"/>
+        <w:ind w:left="454"/>
+      </w:pPr>
+      <w:r>
+        <w:rPr>
+          <w:rFonts w:ascii="Calibri" w:hAnsi="Calibri"/>
+          <w:b w:val="0"/>
+          <w:i w:val="0"/>
+          <w:sz w:val="21"/>
+        </w:rPr>
+        <w:t>'O Heckman resolve a crítica de que estamos vendo apenas os 'bem-sucedidos'. O resultado (λ negativo e gap que cresce com a correção) indica que a exclusão racial do mercado de trabalho é real e que os excluídos estariam em situação ainda pior.'</w:t>
+      </w:r>
+    </w:p>
+    <w:p>
+      <w:pPr>
+        <w:spacing w:after="40"/>
+        <w:ind w:left="454"/>
+      </w:pPr>
+      <w:r>
+        <w:rPr>
+          <w:rFonts w:ascii="Calibri" w:hAnsi="Calibri"/>
+          <w:b w:val="0"/>
+          <w:i w:val="0"/>
+          <w:sz w:val="21"/>
+        </w:rPr>
+        <w:t>'O Chow e o DiD mostram que o gap não convergiu com o tempo — ao contrário, a pandemia o ampliou. Isso afasta a hipótese de convergência gradual pela educação e reforça a necessidade de intervenção estrutural.'</w:t>
+      </w:r>
+    </w:p>
+    <w:p/>
+    <w:p>
+      <w:pPr>
+        <w:pStyle w:val="Heading2"/>
+      </w:pPr>
+      <w:r>
+        <w:rPr>
+          <w:rFonts w:ascii="Calibri" w:hAnsi="Calibri"/>
+          <w:color w:val="1F3864"/>
+        </w:rPr>
+        <w:t>Pesquisa Operacional — Priorização de Políticas (TOPSIS, AHP, LP)</w:t>
+      </w:r>
+    </w:p>
+    <w:p>
+      <w:pPr>
+        <w:spacing w:before="80" w:after="120"/>
+        <w:jc w:val="left"/>
+      </w:pPr>
+      <w:r>
+        <w:rPr>
+          <w:rFonts w:ascii="Calibri" w:hAnsi="Calibri"/>
+          <w:b/>
+          <w:i w:val="0"/>
+          <w:color w:val="1F3864"/>
+          <w:sz w:val="22"/>
+        </w:rPr>
+        <w:t>O que é e por que está na dissertação:</w:t>
+      </w:r>
+    </w:p>
+    <w:p>
+      <w:pPr>
+        <w:pStyle w:val="ListBullet"/>
+        <w:spacing w:after="60"/>
+        <w:ind w:left="283"/>
+      </w:pPr>
+      <w:r>
+        <w:rPr>
+          <w:rFonts w:ascii="Calibri" w:hAnsi="Calibri"/>
+          <w:b w:val="0"/>
+          <w:i w:val="0"/>
+          <w:sz w:val="22"/>
+        </w:rPr>
+        <w:t>PO (Pesquisa Operacional) transforma o diagnóstico empírico em recomendações de política priorizadas objetivamente. Sem PO, a dissertação terminaria com 'há discriminação' — com PO, termina com 'e aqui está a política mais custo-eficaz para combatê-la, formalmente justificada'.</w:t>
+      </w:r>
+    </w:p>
+    <w:p>
+      <w:pPr>
+        <w:pStyle w:val="ListBullet"/>
+        <w:spacing w:after="60"/>
+        <w:ind w:left="283"/>
+      </w:pPr>
+      <w:r>
+        <w:rPr>
+          <w:rFonts w:ascii="Calibri" w:hAnsi="Calibri"/>
+          <w:b w:val="0"/>
+          <w:i w:val="0"/>
+          <w:sz w:val="22"/>
+        </w:rPr>
+        <w:t>Métodos: TOPSIS (ranking multicritério), AHP (pesos dos critérios, CR=0,004 ← consistente), LP (Programação Linear com restrição orçamentária), Pareto frontier (eficiência custo × impacto).</w:t>
+      </w:r>
+    </w:p>
+    <w:p>
+      <w:pPr>
+        <w:spacing w:before="80" w:after="120"/>
+        <w:jc w:val="left"/>
+      </w:pPr>
+      <w:r>
+        <w:rPr>
+          <w:rFonts w:ascii="Calibri" w:hAnsi="Calibri"/>
+          <w:b/>
+          <w:i w:val="0"/>
+          <w:color w:val="1F3864"/>
+          <w:sz w:val="22"/>
+        </w:rPr>
+        <w:t>TOPSIS — Ranking de Políticas (critérios: impacto no gap, custo, viabilidade, prazo):</w:t>
+      </w:r>
+    </w:p>
+    <w:p>
+      <w:pPr>
+        <w:pStyle w:val="ListBullet"/>
+        <w:spacing w:after="60"/>
+        <w:ind w:left="283"/>
+      </w:pPr>
+      <w:r>
+        <w:rPr>
+          <w:rFonts w:ascii="Calibri" w:hAnsi="Calibri"/>
+          <w:b w:val="0"/>
+          <w:i w:val="0"/>
+          <w:sz w:val="22"/>
+        </w:rPr>
+        <w:t>#1 Cotas em CBO 1–4 (P1): CC=0,799 — política mais próxima da 'solução ideal'. Ataca diretamente o mecanismo de exclusão de acesso a ocupações qualificadas que explica 84% do gap via dotações.</w:t>
+      </w:r>
+    </w:p>
+    <w:p>
+      <w:pPr>
+        <w:pStyle w:val="ListBullet"/>
+        <w:spacing w:after="60"/>
+        <w:ind w:left="283"/>
+      </w:pPr>
+      <w:r>
+        <w:rPr>
+          <w:rFonts w:ascii="Calibri" w:hAnsi="Calibri"/>
+          <w:b w:val="0"/>
+          <w:i w:val="0"/>
+          <w:sz w:val="22"/>
+        </w:rPr>
+        <w:t>#2 Equidade Educacional (P2): CC=0,558 — segunda mais eficiente. Reduz o componente de dotações educacionais.</w:t>
+      </w:r>
+    </w:p>
+    <w:p>
+      <w:pPr>
+        <w:pStyle w:val="ListBullet"/>
+        <w:spacing w:after="60"/>
+        <w:ind w:left="283"/>
+      </w:pPr>
+      <w:r>
+        <w:rPr>
+          <w:rFonts w:ascii="Calibri" w:hAnsi="Calibri"/>
+          <w:b w:val="0"/>
+          <w:i w:val="0"/>
+          <w:sz w:val="22"/>
+        </w:rPr>
+        <w:t>#3 Mentoria e Redes (P3): CC=0,388 — responde diretamente ao achado da SNA (betweenness=0 para negros = sem capital social estrutural).</w:t>
+      </w:r>
+    </w:p>
+    <w:p>
+      <w:pPr>
+        <w:pStyle w:val="ListBullet"/>
+        <w:spacing w:after="60"/>
+        <w:ind w:left="283"/>
+      </w:pPr>
+      <w:r>
+        <w:rPr>
+          <w:rFonts w:ascii="Calibri" w:hAnsi="Calibri"/>
+          <w:b w:val="0"/>
+          <w:i w:val="0"/>
+          <w:sz w:val="22"/>
+        </w:rPr>
+        <w:t>#4 Transparência Salarial (P4): CC=0,324 — ataca os retornos diferenciais (16%).</w:t>
+      </w:r>
+    </w:p>
+    <w:p>
+      <w:pPr>
+        <w:pStyle w:val="ListBullet"/>
+        <w:spacing w:after="60"/>
+        <w:ind w:left="283"/>
+      </w:pPr>
+      <w:r>
+        <w:rPr>
+          <w:rFonts w:ascii="Calibri" w:hAnsi="Calibri"/>
+          <w:b w:val="0"/>
+          <w:i w:val="0"/>
+          <w:sz w:val="22"/>
+        </w:rPr>
+        <w:t>PL-1 (Cotas CBO): projeta redução de 24% do gap bruto em simulações de LP.</w:t>
+      </w:r>
+    </w:p>
+    <w:p>
+      <w:pPr>
+        <w:spacing w:before="80" w:after="120"/>
+        <w:jc w:val="left"/>
+      </w:pPr>
+      <w:r>
+        <w:rPr>
+          <w:rFonts w:ascii="Calibri" w:hAnsi="Calibri"/>
+          <w:b/>
+          <w:i w:val="0"/>
+          <w:color w:val="1F3864"/>
+          <w:sz w:val="22"/>
+        </w:rPr>
+        <w:t>AHP — Consistência dos Pesos:</w:t>
+      </w:r>
+    </w:p>
+    <w:p>
+      <w:pPr>
+        <w:pStyle w:val="ListBullet"/>
+        <w:spacing w:after="60"/>
+        <w:ind w:left="283"/>
+      </w:pPr>
+      <w:r>
+        <w:rPr>
+          <w:rFonts w:ascii="Calibri" w:hAnsi="Calibri"/>
+          <w:b w:val="0"/>
+          <w:i w:val="0"/>
+          <w:sz w:val="22"/>
+        </w:rPr>
+        <w:t>CR=0,004 (&lt; 0,10 = aceitável). A matriz de comparação por pares de critérios é consistente — os pesos refletem preferências racionais e transitivas.</w:t>
+      </w:r>
+    </w:p>
+    <w:p>
+      <w:pPr>
+        <w:spacing w:before="80" w:after="40"/>
+      </w:pPr>
+      <w:r>
+        <w:rPr>
+          <w:rFonts w:ascii="Calibri" w:hAnsi="Calibri"/>
+          <w:b/>
+          <w:i w:val="0"/>
+          <w:color w:val="FF8F00"/>
+          <w:sz w:val="22"/>
+        </w:rPr>
+        <w:t>▌ O que dizer se perguntarem sobre PO:</w:t>
+      </w:r>
+    </w:p>
+    <w:p>
+      <w:pPr>
+        <w:spacing w:after="40"/>
+        <w:ind w:left="454"/>
+      </w:pPr>
+      <w:r>
+        <w:rPr>
+          <w:rFonts w:ascii="Calibri" w:hAnsi="Calibri"/>
+          <w:b w:val="0"/>
+          <w:i w:val="0"/>
+          <w:sz w:val="21"/>
+        </w:rPr>
+        <w:t>'A PO não é um método avaliativo adicional — é a tradução dos resultados empíricos em ação. A decomposição OB mostra que 84% do gap é de dotações → isso informa os pesos do TOPSIS. A SNA mostra que betweenness=0 → isso entra no critério de viabilidade da política P3. Os métodos são encadeados: diagnóstico → priorização → simulação.'</w:t>
+      </w:r>
+    </w:p>
+    <w:p>
+      <w:pPr>
+        <w:spacing w:after="40"/>
+        <w:ind w:left="454"/>
+      </w:pPr>
+      <w:r>
+        <w:rPr>
+          <w:rFonts w:ascii="Calibri" w:hAnsi="Calibri"/>
+          <w:b w:val="0"/>
+          <w:i w:val="0"/>
+          <w:sz w:val="21"/>
+        </w:rPr>
+        <w:t>'O TOPSIS é um método multi-critério MCDM clássico (Hwang &amp; Yoon, 1981). Ele ranqueia alternativas pela distância relativa à solução ideal e à pior solução. CR&lt;0,10 no AHP é o padrão de consistência de Saaty (1980) — garantia de que os pesos derivados da comparação por pares são internamente consistentes.'</w:t>
+      </w:r>
+    </w:p>
+    <w:p/>
+    <w:p>
       <w:r>
         <w:br w:type="page"/>
       </w:r>
@@ -5416,7 +6465,7 @@
           <w:i w:val="0"/>
           <w:sz w:val="22"/>
         </w:rPr>
-        <w:t>β₁ (negro): log-odds de negro vs branco. OR M1=0,705 (sem contexto); OR M2=0,747 (com efeito aleatório de UPA).</w:t>
+        <w:t>β₁ (negro): log-odds de negro vs branco. OR M1=0,704 (sem contexto); OR M2=0,747 (com efeito aleatório de UPA).</w:t>
       </w:r>
     </w:p>
     <w:p>

</xml_diff>

<commit_message>
fix: atualiza run_politicas_po.py com parâmetros GLMM PEA completa e regenera documentos
- run_politicas_po.py: GAP_BRUTO=0.4229→0.4255, OR_CBO14=0.704→0.674, OR_TOP20=0.726→0.536,
  OR_TOP10=0.671→0.453, ICC_UPA=0.262→0.222 (todos da PEA completa N=7.694.198)
- TOPSIS P1 CC=0.799→0.835; LP B=5 redução=24%→25.1%
- Todos os valores propagados para Word TCC, Guia de Estudo e PPTX

Co-Authored-By: Claude Sonnet 4.6 <noreply@anthropic.com>
</commit_message>
<xml_diff>
--- a/guia_estudo_defesa.docx
+++ b/guia_estudo_defesa.docx
@@ -3591,7 +3591,7 @@
           <w:i w:val="0"/>
           <w:sz w:val="22"/>
         </w:rPr>
-        <w:t>Mulher Branca: gap=46,6% — 79% dotações / 109% retornos (retornos negativos, indicando discriminação de gênero pura). Sem penalidade de raça.</w:t>
+        <w:t>Mulher Branca: gap=46,6% — dotações negativas (−8,9%) / retornos 109% (retornos amplificam o gap: discriminação de gênero pura explica mais de 100%). Sem penalidade de raça.</w:t>
       </w:r>
     </w:p>
     <w:p>
@@ -5864,7 +5864,7 @@
           <w:i w:val="0"/>
           <w:sz w:val="22"/>
         </w:rPr>
-        <w:t>Interpretação: a pandemia AMPLIOU o gap racial em 1,5 p.p. de log-renda — negros foram desproporcionalmente afetados pelo choque COVID.</w:t>
+        <w:t>Interpretação: τ=+0,015 indica **convergência aparente** de curto prazo — o gap reduziu-se 1,5 p.p. após 2020. Provável seleção de saída: negros de menor renda saíram do mercado formal, elevando a renda relativa dos que ficaram.</w:t>
       </w:r>
     </w:p>
     <w:p>
@@ -5909,7 +5909,7 @@
           <w:i w:val="0"/>
           <w:sz w:val="21"/>
         </w:rPr>
-        <w:t>'O Chow e o DiD mostram que o gap não convergiu com o tempo — ao contrário, a pandemia o ampliou. Isso afasta a hipótese de convergência gradual pela educação e reforça a necessidade de intervenção estrutural.'</w:t>
+        <w:t>'O Chow mostra quebra estrutural em 2020. O DiD mostra convergência aparente de curto prazo (τ=+0.015): negros sofreram menos no diferencial salarial, mas provavelmente por seleção de saída — não por melhora real. O gap de longo prazo permanece estável.'</w:t>
       </w:r>
     </w:p>
     <w:p/>
@@ -6002,7 +6002,7 @@
           <w:i w:val="0"/>
           <w:sz w:val="22"/>
         </w:rPr>
-        <w:t>#1 Cotas em CBO 1–4 (P1): CC=0,799 — política mais próxima da 'solução ideal'. Ataca diretamente o mecanismo de exclusão de acesso a ocupações qualificadas que explica 84% do gap via dotações.</w:t>
+        <w:t>#1 Cotas em CBO 1–4 (P1): CC=0,835 — política mais próxima da 'solução ideal'. Ataca diretamente o mecanismo de exclusão de acesso a ocupações qualificadas que explica 84% do gap via dotações.</w:t>
       </w:r>
     </w:p>
     <w:p>
@@ -6018,7 +6018,7 @@
           <w:i w:val="0"/>
           <w:sz w:val="22"/>
         </w:rPr>
-        <w:t>#2 Equidade Educacional (P2): CC=0,558 — segunda mais eficiente. Reduz o componente de dotações educacionais.</w:t>
+        <w:t>#2 Equidade Educacional (P2): CC=0,588 — segunda mais eficiente. Reduz o componente de dotações educacionais.</w:t>
       </w:r>
     </w:p>
     <w:p>
@@ -6034,7 +6034,7 @@
           <w:i w:val="0"/>
           <w:sz w:val="22"/>
         </w:rPr>
-        <w:t>#3 Mentoria e Redes (P3): CC=0,388 — responde diretamente ao achado da SNA (betweenness=0 para negros = sem capital social estrutural).</w:t>
+        <w:t>#3 Mentoria e Redes (P3): CC=0,396 — responde diretamente ao achado da SNA (betweenness=0 para negros = sem capital social estrutural).</w:t>
       </w:r>
     </w:p>
     <w:p>
@@ -6050,7 +6050,7 @@
           <w:i w:val="0"/>
           <w:sz w:val="22"/>
         </w:rPr>
-        <w:t>#4 Transparência Salarial (P4): CC=0,324 — ataca os retornos diferenciais (16%).</w:t>
+        <w:t>#4 Transparência Salarial (P4): CC=0,342 — ataca os retornos diferenciais (16%).</w:t>
       </w:r>
     </w:p>
     <w:p>
@@ -6066,7 +6066,7 @@
           <w:i w:val="0"/>
           <w:sz w:val="22"/>
         </w:rPr>
-        <w:t>PL-1 (Cotas CBO): projeta redução de 24% do gap bruto em simulações de LP.</w:t>
+        <w:t>PL-1 (Cotas CBO): projeta redução de 25% do gap bruto em simulações de LP.</w:t>
       </w:r>
     </w:p>
     <w:p>

</xml_diff>

<commit_message>
feat: HLM random slope por setor (salario) + nivel de genero — reforco da hipotese do Estado
Fase A (1+2+3):
- HLM salario por setor: setor publico ATENUA o gap racial (-7,8% vs -11,2%
  privado) e o HOMOGENEIZA entre UFs (tau2 0,0014 vs 0,0022) — contraste com o
  acesso (GLMM), onde nao atenua. Precisa "o Estado ajuda mas nao resolve":
  equaliza a remuneracao de quem entra, nao a entrada.
- Random slope conjunto (1+negro+sexo_fem|UF): o gap de GENERO tambem varia
  geograficamente (LRT LR=15.775, p<0,001), com dispersao MAIOR que a racial
  (DP 0,064 vs 0,050); rho(negro,sexo)=-0,46 (compensatorias entre UFs).
- Integrado em .tex (subsec hlm_rs/glmm_rs), Word (4.1f) e guia, via
  params.HRS_* + chk() no validador (verde 0/0). PDF: 28 paginas.

Co-Authored-By: Claude Opus 4.8 <noreply@anthropic.com>
</commit_message>
<xml_diff>
--- a/guia_estudo_defesa.docx
+++ b/guia_estudo_defesa.docx
@@ -6399,6 +6399,38 @@
           <w:sz w:val="22"/>
         </w:rPr>
         <w:t>Setor: o concurso público NÃO dissolve a barreira de acesso (OR público=0,705 ≈ privado=0,695) nem a homogeneíza entre UFs — refina 'o Estado ajuda, mas não resolve'.</w:t>
+      </w:r>
+    </w:p>
+    <w:p>
+      <w:pPr>
+        <w:pStyle w:val="ListBullet"/>
+        <w:spacing w:after="60"/>
+        <w:ind w:left="283"/>
+      </w:pPr>
+      <w:r>
+        <w:rPr>
+          <w:rFonts w:ascii="Calibri" w:hAnsi="Calibri"/>
+          <w:b w:val="0"/>
+          <w:i w:val="0"/>
+          <w:sz w:val="22"/>
+        </w:rPr>
+        <w:t>Contraste SALÁRIO × ACESSO (HLM por setor): no salário o público ATENUA o gap racial (7,8% vs 11,2% privado) e o homogeneíza entre UFs; no acesso, não. Frase de defesa: 'o concurso equaliza o pagamento de quem entra, não a entrada'.</w:t>
+      </w:r>
+    </w:p>
+    <w:p>
+      <w:pPr>
+        <w:pStyle w:val="ListBullet"/>
+        <w:spacing w:after="60"/>
+        <w:ind w:left="283"/>
+      </w:pPr>
+      <w:r>
+        <w:rPr>
+          <w:rFonts w:ascii="Calibri" w:hAnsi="Calibri"/>
+          <w:b w:val="0"/>
+          <w:i w:val="0"/>
+          <w:sz w:val="22"/>
+        </w:rPr>
+        <w:t>Nível de gênero (HLM): o gap de gênero também varia entre estados (LRT p&lt;0,001), com dispersão MAIOR que o racial (DP 0,064 vs 0,050); ρ negativo (−0,46) — onde a penalidade racial é maior, a de gênero tende a ser menor.</w:t>
       </w:r>
     </w:p>
     <w:p/>

</xml_diff>

<commit_message>
fix: corrige layout do mapa "O Racismo Tem Endereco" e reinsere nos documentos
- Disposicao dos estados: o ylim superior cortava a linha 1 (RR/AP), que
  invadia a area do titulo e quebrava o alinhamento vertical. Corrigido com
  margem no ylim (-10,05 a 0,05); grade agora alinhada Norte->Sul no eixo Y.
- Titulo/subtitulo movidos para coordenadas de figura, acima da grade (sem
  sobreposicao com os tiles).
- Mapa regenerado e reinserido em: relatorio (.tex/PDF), Word, guia e 3
  apresentacoes (tecnica, executiva e leiga). PDF 28 paginas, 0 erros.

Co-Authored-By: Claude Opus 4.8 <noreply@anthropic.com>
</commit_message>
<xml_diff>
--- a/guia_estudo_defesa.docx
+++ b/guia_estudo_defesa.docx
@@ -6483,7 +6483,7 @@
       <w:r>
         <w:drawing>
           <wp:inline xmlns:a="http://schemas.openxmlformats.org/drawingml/2006/main" xmlns:pic="http://schemas.openxmlformats.org/drawingml/2006/picture">
-            <wp:extent cx="4320000" cy="4831890"/>
+            <wp:extent cx="4320000" cy="4185476"/>
             <wp:docPr id="19" name="Picture 19"/>
             <wp:cNvGraphicFramePr>
               <a:graphicFrameLocks noChangeAspect="1"/>
@@ -6504,7 +6504,7 @@
                   <pic:spPr>
                     <a:xfrm>
                       <a:off x="0" y="0"/>
-                      <a:ext cx="4320000" cy="4831890"/>
+                      <a:ext cx="4320000" cy="4185476"/>
                     </a:xfrm>
                     <a:prstGeom prst="rect"/>
                   </pic:spPr>

</xml_diff>

<commit_message>
fix: sincroniza valores setoriais (H2/H3) com a figura atual nos decks/guia/Word
Os gaps por setor estavam desatualizados e inconsistentes entre arquivos.
Sincronizados com a figura atual estado_h2h3_gaps.png (fonte autoritativa):
- Racial controlado: publico -28,3% | privado -34,5% (era -24,6/-25,2 vs -29,2)
- Racial bruto: publico -32,4% | privado -44,1%
- Genero controlado: publico -20,9% | privado -18,6% (era -18,8/-20,8 vs -16,9)
- Diferencas recalculadas: racial 6,2 pp; genero 2,3 pp.
Aplicado em apresentacao_executiva (leigo), apresentacao_tcc (tecnico),
guia_estudo_defesa e relatorio (Word). Decks/docs regenerados.

Co-Authored-By: Claude Opus 4.8 <noreply@anthropic.com>
</commit_message>
<xml_diff>
--- a/guia_estudo_defesa.docx
+++ b/guia_estudo_defesa.docx
@@ -4632,7 +4632,7 @@
           <w:i w:val="0"/>
           <w:sz w:val="22"/>
         </w:rPr>
-        <w:t>Gap racial bruto: privado −44,1% / público −33,3%. Controlado: privado −29,2% / público −25,2%.</w:t>
+        <w:t>Gap racial bruto: privado −44,1% / público −32,4%. Controlado: privado −34,5% / público −28,3%.</w:t>
       </w:r>
     </w:p>
     <w:p>
@@ -4648,7 +4648,7 @@
           <w:i w:val="0"/>
           <w:sz w:val="22"/>
         </w:rPr>
-        <w:t>Gap de gênero: privado −16,9% / público −18,8% (após controles). O setor público tem gap de GÊNERO maior que o privado — o paradoxo H3.</w:t>
+        <w:t>Gap de gênero: privado −18,6% / público −20,9% (após controles). O setor público tem gap de GÊNERO maior que o privado — o paradoxo H3.</w:t>
       </w:r>
     </w:p>
     <w:p>

</xml_diff>

<commit_message>
docs: guia de defesa — adiciona contexto IBGE (A+B) e interseccionalidade grupo_rg
- Figura 9d (grupo_rg GLMM): o "flip" interseccional (mulher negra alçada no
  acesso OR=1,33, mais excluída no topo OR=0,34) + Q&A "o que dizer na defesa".
- Bloco "Contexto macro recente do IBGE (POF + Gini 2025)": distingue qualidade
  de vida (melhorou, POF) de desigualdade de renda (Gini subiu p/ 0,491 em 2025),
  com ressalva metodológica (Gini do trabalho ~0,48 != domiciliar per capita ~0,49)
  e respostas prontas para a banca. Fecha a consistência entre todos os documentos.

Co-Authored-By: Claude Opus 4.8 <noreply@anthropic.com>
</commit_message>
<xml_diff>
--- a/guia_estudo_defesa.docx
+++ b/guia_estudo_defesa.docx
@@ -2957,7 +2957,7 @@
           <w:i w:val="0"/>
           <w:sz w:val="22"/>
         </w:rPr>
-        <w:t>AME M1 = −5,07 p.p.: sem controle de contexto, negros têm 5,07 p.p. a menos de probabilidade de ocupação qualificada.</w:t>
+        <w:t>AME M1 = −5,04 p.p.: sem controle de contexto, negros têm 5,04 p.p. a menos de probabilidade de ocupação qualificada.</w:t>
       </w:r>
     </w:p>
     <w:p>
@@ -2973,7 +2973,7 @@
           <w:i w:val="0"/>
           <w:sz w:val="22"/>
         </w:rPr>
-        <w:t>AME M2 = −4,75 p.p.: com efeito aleatório de UPA, o efeito líquido de ser negro é −4,75 p.p. — discriminação pura de acesso após controlar moradia e contexto.</w:t>
+        <w:t>AME M2 = −4,73 p.p.: com efeito aleatório de UPA, o efeito líquido de ser negro é −4,73 p.p. — discriminação pura de acesso após controlar moradia e contexto.</w:t>
       </w:r>
     </w:p>
     <w:p>
@@ -3681,6 +3681,197 @@
           <w:rFonts w:ascii="Calibri" w:hAnsi="Calibri"/>
           <w:color w:val="1F3864"/>
         </w:rPr>
+        <w:t>Figura 9d — Interseccionalidade GLMM (grupo_rg): o teto de vidro recai sobre a mulher negra</w:t>
+      </w:r>
+    </w:p>
+    <w:p>
+      <w:pPr>
+        <w:jc w:val="center"/>
+      </w:pPr>
+      <w:r>
+        <w:drawing>
+          <wp:inline xmlns:a="http://schemas.openxmlformats.org/drawingml/2006/main" xmlns:pic="http://schemas.openxmlformats.org/drawingml/2006/picture">
+            <wp:extent cx="5040000" cy="3332732"/>
+            <wp:docPr id="10" name="Picture 10"/>
+            <wp:cNvGraphicFramePr>
+              <a:graphicFrameLocks noChangeAspect="1"/>
+            </wp:cNvGraphicFramePr>
+            <a:graphic>
+              <a:graphicData uri="http://schemas.openxmlformats.org/drawingml/2006/picture">
+                <pic:pic>
+                  <pic:nvPicPr>
+                    <pic:cNvPr id="0" name="grupo_rg_interseccional.png"/>
+                    <pic:cNvPicPr/>
+                  </pic:nvPicPr>
+                  <pic:blipFill>
+                    <a:blip r:embed="rId18"/>
+                    <a:stretch>
+                      <a:fillRect/>
+                    </a:stretch>
+                  </pic:blipFill>
+                  <pic:spPr>
+                    <a:xfrm>
+                      <a:off x="0" y="0"/>
+                      <a:ext cx="5040000" cy="3332732"/>
+                    </a:xfrm>
+                    <a:prstGeom prst="rect"/>
+                  </pic:spPr>
+                </pic:pic>
+              </a:graphicData>
+            </a:graphic>
+          </wp:inline>
+        </w:drawing>
+      </w:r>
+    </w:p>
+    <w:p>
+      <w:pPr>
+        <w:spacing w:after="200"/>
+        <w:jc w:val="center"/>
+      </w:pPr>
+      <w:r>
+        <w:rPr>
+          <w:i/>
+          <w:color w:val="606060"/>
+          <w:sz w:val="18"/>
+        </w:rPr>
+        <w:t>OR dos 4 grupos raça×gênero vs. homem branco em 3 desfechos. A mulher negra é alçada no acesso à categoria, mas a mais excluída no topo da renda.</w:t>
+      </w:r>
+    </w:p>
+    <w:p>
+      <w:pPr>
+        <w:spacing w:before="80" w:after="120"/>
+        <w:jc w:val="left"/>
+      </w:pPr>
+      <w:r>
+        <w:rPr>
+          <w:rFonts w:ascii="Calibri" w:hAnsi="Calibri"/>
+          <w:b/>
+          <w:i w:val="0"/>
+          <w:color w:val="1F3864"/>
+          <w:sz w:val="22"/>
+        </w:rPr>
+        <w:t>Como ler:</w:t>
+      </w:r>
+    </w:p>
+    <w:p>
+      <w:pPr>
+        <w:pStyle w:val="ListBullet"/>
+        <w:spacing w:after="60"/>
+        <w:ind w:left="283"/>
+      </w:pPr>
+      <w:r>
+        <w:rPr>
+          <w:rFonts w:ascii="Calibri" w:hAnsi="Calibri"/>
+          <w:b w:val="0"/>
+          <w:i w:val="0"/>
+          <w:sz w:val="22"/>
+        </w:rPr>
+        <w:t>GLMM com fator de 4 grupos (homem branco = referência) + interação negro×sexo_fem, em 3 desfechos: acesso a CBO 1–4, renda no top 20% e no top 10%.</w:t>
+      </w:r>
+    </w:p>
+    <w:p>
+      <w:pPr>
+        <w:pStyle w:val="ListBullet"/>
+        <w:spacing w:after="60"/>
+        <w:ind w:left="283"/>
+      </w:pPr>
+      <w:r>
+        <w:rPr>
+          <w:rFonts w:ascii="Calibri" w:hAnsi="Calibri"/>
+          <w:b w:val="0"/>
+          <w:i w:val="0"/>
+          <w:sz w:val="22"/>
+        </w:rPr>
+        <w:t>ACESSO (CBO 1–4): mulher negra OR=1,33 (ACIMA do homem branco — profissões feminizadas são CBO 1–4); o mais penalizado é o homem negro (OR=0,65).</w:t>
+      </w:r>
+    </w:p>
+    <w:p>
+      <w:pPr>
+        <w:pStyle w:val="ListBullet"/>
+        <w:spacing w:after="60"/>
+        <w:ind w:left="283"/>
+      </w:pPr>
+      <w:r>
+        <w:rPr>
+          <w:rFonts w:ascii="Calibri" w:hAnsi="Calibri"/>
+          <w:b w:val="0"/>
+          <w:i w:val="0"/>
+          <w:sz w:val="22"/>
+        </w:rPr>
+        <w:t>TOPO da renda (top 10%): INVERTE — a mulher negra é a MAIS excluída (OR=0,34), abaixo da mulher branca (0,49) e do homem negro (0,65).</w:t>
+      </w:r>
+    </w:p>
+    <w:p>
+      <w:pPr>
+        <w:pStyle w:val="ListBullet"/>
+        <w:spacing w:after="60"/>
+        <w:ind w:left="283"/>
+      </w:pPr>
+      <w:r>
+        <w:rPr>
+          <w:rFonts w:ascii="Calibri" w:hAnsi="Calibri"/>
+          <w:b w:val="0"/>
+          <w:i w:val="0"/>
+          <w:sz w:val="22"/>
+        </w:rPr>
+        <w:t>Interação sub-aditiva (OR=1,14 no acesso): a penalidade racial é um pouco menor entre mulheres — mas a negra acumula raça + teto de vidro de gênero no topo.</w:t>
+      </w:r>
+    </w:p>
+    <w:p>
+      <w:pPr>
+        <w:spacing w:before="80" w:after="40"/>
+      </w:pPr>
+      <w:r>
+        <w:rPr>
+          <w:rFonts w:ascii="Calibri" w:hAnsi="Calibri"/>
+          <w:b/>
+          <w:i w:val="0"/>
+          <w:color w:val="FF8F00"/>
+          <w:sz w:val="22"/>
+        </w:rPr>
+        <w:t>▌ O que dizer se perguntarem sobre interseccionalidade (GLMM):</w:t>
+      </w:r>
+    </w:p>
+    <w:p>
+      <w:pPr>
+        <w:spacing w:after="40"/>
+        <w:ind w:left="454"/>
+      </w:pPr>
+      <w:r>
+        <w:rPr>
+          <w:rFonts w:ascii="Calibri" w:hAnsi="Calibri"/>
+          <w:b w:val="0"/>
+          <w:i w:val="0"/>
+          <w:sz w:val="21"/>
+        </w:rPr>
+        <w:t>'O efeito não é uniforme entre desfechos. No ACESSO à categoria qualificada, a mulher negra é até alçada (OR 1,33), porque profissões feminizadas — magistério, enfermagem, administrativo — são CBO 1–4; o mais barrado é o homem negro. Mas no TOPO da renda o quadro inverte: a mulher negra é a mais excluída de todas (OR 0,34 no decil superior). O teto de vidro não é racial nem sexualmente neutro — recai com força máxima sobre ela.'</w:t>
+      </w:r>
+    </w:p>
+    <w:p>
+      <w:pPr>
+        <w:spacing w:after="40"/>
+        <w:ind w:left="454"/>
+      </w:pPr>
+      <w:r>
+        <w:rPr>
+          <w:rFonts w:ascii="Calibri" w:hAnsi="Calibri"/>
+          <w:b w:val="0"/>
+          <w:i w:val="0"/>
+          <w:sz w:val="21"/>
+        </w:rPr>
+        <w:t>'A interação é sub-aditiva (não é soma simples), mas isso não a protege: ela pode ENTRAR em ocupações qualificadas, mas é sistematicamente barrada de CHEGAR AO TOPO da remuneração — raça e gênero se combinam exatamente onde mais importa para a ascensão.'</w:t>
+      </w:r>
+    </w:p>
+    <w:p/>
+    <w:p>
+      <w:pPr>
+        <w:pStyle w:val="Heading2"/>
+      </w:pPr>
+      <w:r>
+        <w:rPr>
+          <w:rFonts w:ascii="Calibri" w:hAnsi="Calibri"/>
+          <w:color w:val="1F3864"/>
+        </w:rPr>
         <w:t>Figura 10 — SHAP Values: Importância das Variáveis no XGBoost</w:t>
       </w:r>
     </w:p>
@@ -3692,7 +3883,7 @@
         <w:drawing>
           <wp:inline xmlns:a="http://schemas.openxmlformats.org/drawingml/2006/main" xmlns:pic="http://schemas.openxmlformats.org/drawingml/2006/picture">
             <wp:extent cx="5040000" cy="3736625"/>
-            <wp:docPr id="10" name="Picture 10"/>
+            <wp:docPr id="11" name="Picture 11"/>
             <wp:cNvGraphicFramePr>
               <a:graphicFrameLocks noChangeAspect="1"/>
             </wp:cNvGraphicFramePr>
@@ -3704,7 +3895,7 @@
                     <pic:cNvPicPr/>
                   </pic:nvPicPr>
                   <pic:blipFill>
-                    <a:blip r:embed="rId18"/>
+                    <a:blip r:embed="rId19"/>
                     <a:stretch>
                       <a:fillRect/>
                     </a:stretch>
@@ -4124,7 +4315,7 @@
         <w:drawing>
           <wp:inline xmlns:a="http://schemas.openxmlformats.org/drawingml/2006/main" xmlns:pic="http://schemas.openxmlformats.org/drawingml/2006/picture">
             <wp:extent cx="5040000" cy="3769412"/>
-            <wp:docPr id="11" name="Picture 11"/>
+            <wp:docPr id="12" name="Picture 12"/>
             <wp:cNvGraphicFramePr>
               <a:graphicFrameLocks noChangeAspect="1"/>
             </wp:cNvGraphicFramePr>
@@ -4136,7 +4327,7 @@
                     <pic:cNvPicPr/>
                   </pic:nvPicPr>
                   <pic:blipFill>
-                    <a:blip r:embed="rId19"/>
+                    <a:blip r:embed="rId20"/>
                     <a:stretch>
                       <a:fillRect/>
                     </a:stretch>
@@ -4348,7 +4539,7 @@
         <w:drawing>
           <wp:inline xmlns:a="http://schemas.openxmlformats.org/drawingml/2006/main" xmlns:pic="http://schemas.openxmlformats.org/drawingml/2006/picture">
             <wp:extent cx="5040000" cy="2121282"/>
-            <wp:docPr id="12" name="Picture 12"/>
+            <wp:docPr id="13" name="Picture 13"/>
             <wp:cNvGraphicFramePr>
               <a:graphicFrameLocks noChangeAspect="1"/>
             </wp:cNvGraphicFramePr>
@@ -4360,7 +4551,7 @@
                     <pic:cNvPicPr/>
                   </pic:nvPicPr>
                   <pic:blipFill>
-                    <a:blip r:embed="rId20"/>
+                    <a:blip r:embed="rId21"/>
                     <a:stretch>
                       <a:fillRect/>
                     </a:stretch>
@@ -4515,6 +4706,142 @@
           <w:rFonts w:ascii="Calibri" w:hAnsi="Calibri"/>
           <w:color w:val="1F3864"/>
         </w:rPr>
+        <w:t>Contexto macro recente do IBGE (POF + Gini 2025) — o que dizer se a banca perguntar</w:t>
+      </w:r>
+    </w:p>
+    <w:p>
+      <w:pPr>
+        <w:spacing w:before="40" w:after="120"/>
+        <w:jc w:val="left"/>
+      </w:pPr>
+      <w:r>
+        <w:rPr>
+          <w:rFonts w:ascii="Calibri" w:hAnsi="Calibri"/>
+          <w:b w:val="0"/>
+          <w:i w:val="0"/>
+          <w:sz w:val="22"/>
+        </w:rPr>
+        <w:t>A banca pode citar notícias recentes do IBGE. Distinga o que melhorou (qualidade de vida) do que NÃO melhorou (desigualdade de renda):</w:t>
+      </w:r>
+    </w:p>
+    <w:p>
+      <w:pPr>
+        <w:pStyle w:val="ListBullet"/>
+        <w:spacing w:after="60"/>
+        <w:ind w:left="283"/>
+      </w:pPr>
+      <w:r>
+        <w:rPr>
+          <w:rFonts w:ascii="Calibri" w:hAnsi="Calibri"/>
+          <w:b w:val="0"/>
+          <w:i w:val="0"/>
+          <w:sz w:val="22"/>
+        </w:rPr>
+        <w:t>A) QUALIDADE DE VIDA melhorou (POF 2017–2018): o Índice de Perda de Qualidade de Vida caiu ~30%, MAS o gap racial persiste (chefes pretos/pardos 0,183 vs brancos 0,122) e o territorial também (Norte 0,223 / Nordeste 0,207 vs Sul 0,114).</w:t>
+      </w:r>
+    </w:p>
+    <w:p>
+      <w:pPr>
+        <w:pStyle w:val="ListBullet"/>
+        <w:spacing w:after="60"/>
+        <w:ind w:left="283"/>
+      </w:pPr>
+      <w:r>
+        <w:rPr>
+          <w:rFonts w:ascii="Calibri" w:hAnsi="Calibri"/>
+          <w:b w:val="0"/>
+          <w:i w:val="0"/>
+          <w:sz w:val="22"/>
+        </w:rPr>
+        <w:t>B) DESIGUALDADE DE RENDA subiu: o Gini do rendimento domiciliar per capita subiu de 0,487 (2024) para 0,491 (2025), puxado pelo topo — 10% mais ricos +8,7% vs 10% mais pobres +3,1% (PNAD Contínua, Rendimento de Todas as Fontes 2025).</w:t>
+      </w:r>
+    </w:p>
+    <w:p>
+      <w:pPr>
+        <w:pStyle w:val="ListBullet"/>
+        <w:spacing w:after="60"/>
+        <w:ind w:left="283"/>
+      </w:pPr>
+      <w:r>
+        <w:rPr>
+          <w:rFonts w:ascii="Calibri" w:hAnsi="Calibri"/>
+          <w:b w:val="0"/>
+          <w:i w:val="0"/>
+          <w:sz w:val="22"/>
+        </w:rPr>
+        <w:t>RESSALVA METODOLÓGICA (importante): o Gini calculado no trabalho (~0,48) é da RENDA DO TRABALHO entre OCUPADOS — conceito DIFERENTE do Gini domiciliar per capita de todas as fontes do IBGE (~0,49). Níveis próximos, mas medidas distintas; podem divergir em tendência (a alta de 2025 vem de renda não-trabalho do topo).</w:t>
+      </w:r>
+    </w:p>
+    <w:p>
+      <w:pPr>
+        <w:spacing w:before="80" w:after="40"/>
+      </w:pPr>
+      <w:r>
+        <w:rPr>
+          <w:rFonts w:ascii="Calibri" w:hAnsi="Calibri"/>
+          <w:b/>
+          <w:i w:val="0"/>
+          <w:color w:val="FF8F00"/>
+          <w:sz w:val="22"/>
+        </w:rPr>
+        <w:t>▌ O que dizer se perguntarem 'o Gini do IBGE não bate com o seu?' ou 'o Brasil não melhorou?':</w:t>
+      </w:r>
+    </w:p>
+    <w:p>
+      <w:pPr>
+        <w:spacing w:after="40"/>
+        <w:ind w:left="454"/>
+      </w:pPr>
+      <w:r>
+        <w:rPr>
+          <w:rFonts w:ascii="Calibri" w:hAnsi="Calibri"/>
+          <w:b w:val="0"/>
+          <w:i w:val="0"/>
+          <w:sz w:val="21"/>
+        </w:rPr>
+        <w:t>'O que melhorou foi a QUALIDADE DE VIDA (POF), não o Gini de renda — que, aliás, SUBIU em 2025 (0,491), puxado pelo topo. Meu trabalho é coerente com isso: documenta uma barreira racial que persiste apesar do avanço social agregado.'</w:t>
+      </w:r>
+    </w:p>
+    <w:p>
+      <w:pPr>
+        <w:spacing w:after="40"/>
+        <w:ind w:left="454"/>
+      </w:pPr>
+      <w:r>
+        <w:rPr>
+          <w:rFonts w:ascii="Calibri" w:hAnsi="Calibri"/>
+          <w:b w:val="0"/>
+          <w:i w:val="0"/>
+          <w:sz w:val="21"/>
+        </w:rPr>
+        <w:t>'Meu Gini (~0,48) e o do IBGE (~0,49) medem coisas diferentes: o meu é da renda do TRABALHO entre OCUPADOS; o do IBGE é da renda DOMICILIAR PER CAPITA de TODAS as fontes (inclui aposentadorias, transferências, capital e pessoas sem renda). Níveis próximos, mas não diretamente comparáveis — por isso não os comparo como se fossem a mesma métrica.'</w:t>
+      </w:r>
+    </w:p>
+    <w:p>
+      <w:pPr>
+        <w:spacing w:after="40"/>
+        <w:ind w:left="454"/>
+      </w:pPr>
+      <w:r>
+        <w:rPr>
+          <w:rFonts w:ascii="Calibri" w:hAnsi="Calibri"/>
+          <w:b w:val="0"/>
+          <w:i w:val="0"/>
+          <w:sz w:val="21"/>
+        </w:rPr>
+        <w:t>'O contraste territorial reforça minha tese: o IBGE mostra o DF com a maior renda per capita do país, enquanto meus modelos mostram o DF com a MAIOR penalidade racial salarial — riqueza média e desigualdade racial convivem no mesmo território.'</w:t>
+      </w:r>
+    </w:p>
+    <w:p/>
+    <w:p>
+      <w:pPr>
+        <w:pStyle w:val="Heading2"/>
+      </w:pPr>
+      <w:r>
+        <w:rPr>
+          <w:rFonts w:ascii="Calibri" w:hAnsi="Calibri"/>
+          <w:color w:val="1F3864"/>
+        </w:rPr>
         <w:t>Figura 13 — Gaps Racial e de Gênero por Setor (H2/H3)</w:t>
       </w:r>
     </w:p>
@@ -4526,7 +4853,7 @@
         <w:drawing>
           <wp:inline xmlns:a="http://schemas.openxmlformats.org/drawingml/2006/main" xmlns:pic="http://schemas.openxmlformats.org/drawingml/2006/picture">
             <wp:extent cx="5040000" cy="2123888"/>
-            <wp:docPr id="13" name="Picture 13"/>
+            <wp:docPr id="14" name="Picture 14"/>
             <wp:cNvGraphicFramePr>
               <a:graphicFrameLocks noChangeAspect="1"/>
             </wp:cNvGraphicFramePr>
@@ -4538,7 +4865,7 @@
                     <pic:cNvPicPr/>
                   </pic:nvPicPr>
                   <pic:blipFill>
-                    <a:blip r:embed="rId21"/>
+                    <a:blip r:embed="rId22"/>
                     <a:stretch>
                       <a:fillRect/>
                     </a:stretch>
@@ -4720,7 +5047,7 @@
         <w:drawing>
           <wp:inline xmlns:a="http://schemas.openxmlformats.org/drawingml/2006/main" xmlns:pic="http://schemas.openxmlformats.org/drawingml/2006/picture">
             <wp:extent cx="5040000" cy="2122380"/>
-            <wp:docPr id="14" name="Picture 14"/>
+            <wp:docPr id="15" name="Picture 15"/>
             <wp:cNvGraphicFramePr>
               <a:graphicFrameLocks noChangeAspect="1"/>
             </wp:cNvGraphicFramePr>
@@ -4732,7 +5059,7 @@
                     <pic:cNvPicPr/>
                   </pic:nvPicPr>
                   <pic:blipFill>
-                    <a:blip r:embed="rId22"/>
+                    <a:blip r:embed="rId23"/>
                     <a:stretch>
                       <a:fillRect/>
                     </a:stretch>
@@ -4930,7 +5257,7 @@
         <w:drawing>
           <wp:inline xmlns:a="http://schemas.openxmlformats.org/drawingml/2006/main" xmlns:pic="http://schemas.openxmlformats.org/drawingml/2006/picture">
             <wp:extent cx="5040000" cy="2117581"/>
-            <wp:docPr id="15" name="Picture 15"/>
+            <wp:docPr id="16" name="Picture 16"/>
             <wp:cNvGraphicFramePr>
               <a:graphicFrameLocks noChangeAspect="1"/>
             </wp:cNvGraphicFramePr>
@@ -4942,7 +5269,7 @@
                     <pic:cNvPicPr/>
                   </pic:nvPicPr>
                   <pic:blipFill>
-                    <a:blip r:embed="rId23"/>
+                    <a:blip r:embed="rId24"/>
                     <a:stretch>
                       <a:fillRect/>
                     </a:stretch>
@@ -5108,7 +5435,7 @@
         <w:drawing>
           <wp:inline xmlns:a="http://schemas.openxmlformats.org/drawingml/2006/main" xmlns:pic="http://schemas.openxmlformats.org/drawingml/2006/picture">
             <wp:extent cx="5040000" cy="2120041"/>
-            <wp:docPr id="16" name="Picture 16"/>
+            <wp:docPr id="17" name="Picture 17"/>
             <wp:cNvGraphicFramePr>
               <a:graphicFrameLocks noChangeAspect="1"/>
             </wp:cNvGraphicFramePr>
@@ -5120,7 +5447,7 @@
                     <pic:cNvPicPr/>
                   </pic:nvPicPr>
                   <pic:blipFill>
-                    <a:blip r:embed="rId24"/>
+                    <a:blip r:embed="rId25"/>
                     <a:stretch>
                       <a:fillRect/>
                     </a:stretch>
@@ -5318,7 +5645,7 @@
         <w:drawing>
           <wp:inline xmlns:a="http://schemas.openxmlformats.org/drawingml/2006/main" xmlns:pic="http://schemas.openxmlformats.org/drawingml/2006/picture">
             <wp:extent cx="5040000" cy="2151338"/>
-            <wp:docPr id="17" name="Picture 17"/>
+            <wp:docPr id="18" name="Picture 18"/>
             <wp:cNvGraphicFramePr>
               <a:graphicFrameLocks noChangeAspect="1"/>
             </wp:cNvGraphicFramePr>
@@ -5330,7 +5657,7 @@
                     <pic:cNvPicPr/>
                   </pic:nvPicPr>
                   <pic:blipFill>
-                    <a:blip r:embed="rId25"/>
+                    <a:blip r:embed="rId26"/>
                     <a:stretch>
                       <a:fillRect/>
                     </a:stretch>
@@ -5512,7 +5839,7 @@
         <w:drawing>
           <wp:inline xmlns:a="http://schemas.openxmlformats.org/drawingml/2006/main" xmlns:pic="http://schemas.openxmlformats.org/drawingml/2006/picture">
             <wp:extent cx="5040000" cy="1938059"/>
-            <wp:docPr id="18" name="Picture 18"/>
+            <wp:docPr id="19" name="Picture 19"/>
             <wp:cNvGraphicFramePr>
               <a:graphicFrameLocks noChangeAspect="1"/>
             </wp:cNvGraphicFramePr>
@@ -5524,7 +5851,7 @@
                     <pic:cNvPicPr/>
                   </pic:nvPicPr>
                   <pic:blipFill>
-                    <a:blip r:embed="rId26"/>
+                    <a:blip r:embed="rId27"/>
                     <a:stretch>
                       <a:fillRect/>
                     </a:stretch>
@@ -6484,7 +6811,7 @@
         <w:drawing>
           <wp:inline xmlns:a="http://schemas.openxmlformats.org/drawingml/2006/main" xmlns:pic="http://schemas.openxmlformats.org/drawingml/2006/picture">
             <wp:extent cx="4320000" cy="4185476"/>
-            <wp:docPr id="19" name="Picture 19"/>
+            <wp:docPr id="20" name="Picture 20"/>
             <wp:cNvGraphicFramePr>
               <a:graphicFrameLocks noChangeAspect="1"/>
             </wp:cNvGraphicFramePr>
@@ -6496,7 +6823,7 @@
                     <pic:cNvPicPr/>
                   </pic:nvPicPr>
                   <pic:blipFill>
-                    <a:blip r:embed="rId27"/>
+                    <a:blip r:embed="rId28"/>
                     <a:stretch>
                       <a:fillRect/>
                     </a:stretch>
@@ -7008,7 +7335,7 @@
           <w:i w:val="0"/>
           <w:sz w:val="22"/>
         </w:rPr>
-        <w:t>AME M1=−5,07 p.p. | AME M2=−4,75 p.p.: interpretados como diferença de probabilidade de ocupação qualificada atribuída à raça, todas as demais características iguais.</w:t>
+        <w:t>AME M1=−5,04 p.p. | AME M2=−4,73 p.p.: interpretados como diferença de probabilidade de ocupação qualificada atribuída à raça, todas as demais características iguais.</w:t>
       </w:r>
     </w:p>
     <w:p>

</xml_diff>

<commit_message>
feat: converte análises amostrais para base POPULACIONAL + overfitting + comparação
A pedido do autor (base populacional, não amostral). Convertidos para população:
- ML/SHAP (era 20% -> 7,69M): R² idêntico (XGB 0,617); SHAP recomputado.
- Regressão Quantílica (era 20% -> pop): β ~idêntico, ICs mais estreitos.
- Segregação CI (era 10% -> pop): gaps ~iguais (≤0,15pp), ICs menores; bootstrap
  capado (SE, não amostra do resultado).
- RIF e Mobilidade: o commitado já era populacional (sem mudança); defaults dos
  scripts ajustados para None (população).

Overfitting do método não-paramétrico na população: gap R²treino-R²teste = 0,0006
(RF e XGB) -> desprezível; mais dados reduzem overfitting. Nota adicionada ao relatório.

Novo: COMPARACAO_AMOSTRA_POPULACAO.md (antigo×novo de todas as análises).
Validador verde; PDF 32 pp.

Co-Authored-By: Claude Opus 4.8 <noreply@anthropic.com>
</commit_message>
<xml_diff>
--- a/guia_estudo_defesa.docx
+++ b/guia_estudo_defesa.docx
@@ -3041,7 +3041,7 @@
       <w:r>
         <w:drawing>
           <wp:inline xmlns:a="http://schemas.openxmlformats.org/drawingml/2006/main" xmlns:pic="http://schemas.openxmlformats.org/drawingml/2006/picture">
-            <wp:extent cx="5040000" cy="2683676"/>
+            <wp:extent cx="5040000" cy="2668235"/>
             <wp:docPr id="8" name="Picture 8"/>
             <wp:cNvGraphicFramePr>
               <a:graphicFrameLocks noChangeAspect="1"/>
@@ -3062,7 +3062,7 @@
                   <pic:spPr>
                     <a:xfrm>
                       <a:off x="0" y="0"/>
-                      <a:ext cx="5040000" cy="2683676"/>
+                      <a:ext cx="5040000" cy="2668235"/>
                     </a:xfrm>
                     <a:prstGeom prst="rect"/>
                   </pic:spPr>

</xml_diff>